<commit_message>
fix: repeat stakeholder rows in docx export
</commit_message>
<xml_diff>
--- a/agent/templates/apn-poc-template_v2.docx
+++ b/agent/templates/apn-poc-template_v2.docx
@@ -1751,7 +1751,7 @@
           </w:tcPr>
           <w:p>
             <w:r>
-              <w:t>{%tr for s in executive_sponsors %}</w:t>
+              <w:t>{%tr for row in executive_sponsors %}</w:t>
             </w:r>
           </w:p>
         </w:tc>
@@ -1781,7 +1781,7 @@
           </w:tcPr>
           <w:p>
             <w:r>
-              <w:t>{{ s.name }}</w:t>
+              <w:t>{{ row.name }}</w:t>
             </w:r>
           </w:p>
         </w:tc>
@@ -1791,7 +1791,7 @@
           </w:tcPr>
           <w:p>
             <w:r>
-              <w:t>{{ s.title }}</w:t>
+              <w:t>{{ row.title }}</w:t>
             </w:r>
           </w:p>
         </w:tc>
@@ -1801,7 +1801,7 @@
           </w:tcPr>
           <w:p>
             <w:r>
-              <w:t>{{ s.description }}</w:t>
+              <w:t>{{ row.description }}</w:t>
             </w:r>
           </w:p>
         </w:tc>
@@ -1811,7 +1811,7 @@
           </w:tcPr>
           <w:p>
             <w:r>
-              <w:t>{{ s.contact }}</w:t>
+              <w:t>{{ row.contact }}</w:t>
             </w:r>
           </w:p>
         </w:tc>
@@ -1926,7 +1926,7 @@
           </w:tcPr>
           <w:p>
             <w:r>
-              <w:t>{%tr for s in stakeholders %}</w:t>
+              <w:t>{%tr for row in stakeholders %}</w:t>
             </w:r>
           </w:p>
         </w:tc>
@@ -1956,7 +1956,7 @@
           </w:tcPr>
           <w:p>
             <w:r>
-              <w:t>{{ s.name }}</w:t>
+              <w:t>{{ row.name }}</w:t>
             </w:r>
           </w:p>
         </w:tc>
@@ -1966,7 +1966,7 @@
           </w:tcPr>
           <w:p>
             <w:r>
-              <w:t>{{ s.title }}</w:t>
+              <w:t>{{ row.title }}</w:t>
             </w:r>
           </w:p>
         </w:tc>
@@ -1976,7 +1976,7 @@
           </w:tcPr>
           <w:p>
             <w:r>
-              <w:t>{{ s.stakeholder_for }}</w:t>
+              <w:t>{{ row.stakeholder_for }}</w:t>
             </w:r>
           </w:p>
         </w:tc>
@@ -1986,7 +1986,7 @@
           </w:tcPr>
           <w:p>
             <w:r>
-              <w:t>{{ s.contact }}</w:t>
+              <w:t>{{ row.contact }}</w:t>
             </w:r>
           </w:p>
         </w:tc>
@@ -2101,7 +2101,7 @@
           </w:tcPr>
           <w:p>
             <w:r>
-              <w:t>{%tr for m in project_team %}</w:t>
+              <w:t>{%tr for row in project_team %}</w:t>
             </w:r>
           </w:p>
         </w:tc>
@@ -2131,7 +2131,7 @@
           </w:tcPr>
           <w:p>
             <w:r>
-              <w:t>{{ m.name }}</w:t>
+              <w:t>{{ row.name }}</w:t>
             </w:r>
           </w:p>
         </w:tc>
@@ -2141,7 +2141,7 @@
           </w:tcPr>
           <w:p>
             <w:r>
-              <w:t>{{ m.title }}</w:t>
+              <w:t>{{ row.title }}</w:t>
             </w:r>
           </w:p>
         </w:tc>
@@ -2151,7 +2151,7 @@
           </w:tcPr>
           <w:p>
             <w:r>
-              <w:t>{{ m.role }}</w:t>
+              <w:t>{{ row.role }}</w:t>
             </w:r>
           </w:p>
         </w:tc>
@@ -2161,7 +2161,7 @@
           </w:tcPr>
           <w:p>
             <w:r>
-              <w:t>{{ m.contact }}</w:t>
+              <w:t>{{ row.contact }}</w:t>
             </w:r>
           </w:p>
         </w:tc>
@@ -2277,7 +2277,7 @@
           </w:tcPr>
           <w:p>
             <w:r>
-              <w:t>{%tr for e in escalation_contacts %}</w:t>
+              <w:t>{%tr for row in escalation_contacts %}</w:t>
             </w:r>
           </w:p>
         </w:tc>
@@ -2307,7 +2307,7 @@
           </w:tcPr>
           <w:p>
             <w:r>
-              <w:t>{{ e.name }}</w:t>
+              <w:t>{{ row.name }}</w:t>
             </w:r>
           </w:p>
         </w:tc>
@@ -2317,7 +2317,7 @@
           </w:tcPr>
           <w:p>
             <w:r>
-              <w:t>{{ e.title }}</w:t>
+              <w:t>{{ row.title }}</w:t>
             </w:r>
           </w:p>
         </w:tc>
@@ -2327,7 +2327,7 @@
           </w:tcPr>
           <w:p>
             <w:r>
-              <w:t>{{ e.role }}</w:t>
+              <w:t>{{ row.role }}</w:t>
             </w:r>
           </w:p>
         </w:tc>
@@ -2337,7 +2337,7 @@
           </w:tcPr>
           <w:p>
             <w:r>
-              <w:t>{{ e.contact }}</w:t>
+              <w:t>{{ row.contact }}</w:t>
             </w:r>
           </w:p>
         </w:tc>

</xml_diff>

<commit_message>
fix: align docx export with structured bullets
</commit_message>
<xml_diff>
--- a/agent/templates/apn-poc-template_v2.docx
+++ b/agent/templates/apn-poc-template_v2.docx
@@ -1,8 +1,8 @@
 
 <file path=word/document.xml><?xml version="1.0" encoding="utf-8"?>
-<w:document xmlns:wpc="http://schemas.microsoft.com/office/word/2010/wordprocessingCanvas" xmlns:cx="http://schemas.microsoft.com/office/drawing/2014/chartex" xmlns:cx1="http://schemas.microsoft.com/office/drawing/2015/9/8/chartex" xmlns:cx2="http://schemas.microsoft.com/office/drawing/2015/10/21/chartex" xmlns:cx3="http://schemas.microsoft.com/office/drawing/2016/5/9/chartex" xmlns:cx4="http://schemas.microsoft.com/office/drawing/2016/5/10/chartex" xmlns:cx5="http://schemas.microsoft.com/office/drawing/2016/5/11/chartex" xmlns:cx6="http://schemas.microsoft.com/office/drawing/2016/5/12/chartex" xmlns:cx7="http://schemas.microsoft.com/office/drawing/2016/5/13/chartex" xmlns:cx8="http://schemas.microsoft.com/office/drawing/2016/5/14/chartex" xmlns:mc="http://schemas.openxmlformats.org/markup-compatibility/2006" xmlns:aink="http://schemas.microsoft.com/office/drawing/2016/ink" xmlns:am3d="http://schemas.microsoft.com/office/drawing/2017/model3d" xmlns:o="urn:schemas-microsoft-com:office:office" xmlns:r="http://schemas.openxmlformats.org/officeDocument/2006/relationships" xmlns:m="http://schemas.openxmlformats.org/officeDocument/2006/math" xmlns:v="urn:schemas-microsoft-com:vml" xmlns:wp14="http://schemas.microsoft.com/office/word/2010/wordprocessingDrawing" xmlns:wp="http://schemas.openxmlformats.org/drawingml/2006/wordprocessingDrawing" xmlns:w10="urn:schemas-microsoft-com:office:word" xmlns:w="http://schemas.openxmlformats.org/wordprocessingml/2006/main" xmlns:w14="http://schemas.microsoft.com/office/word/2010/wordml" xmlns:w15="http://schemas.microsoft.com/office/word/2012/wordml" xmlns:w16cex="http://schemas.microsoft.com/office/word/2018/wordml/cex" xmlns:w16cid="http://schemas.microsoft.com/office/word/2016/wordml/cid" xmlns:w16="http://schemas.microsoft.com/office/word/2018/wordml" xmlns:w16sdtdh="http://schemas.microsoft.com/office/word/2020/wordml/sdtdatahash" xmlns:w16se="http://schemas.microsoft.com/office/word/2015/wordml/symex" xmlns:wpg="http://schemas.microsoft.com/office/word/2010/wordprocessingGroup" xmlns:wpi="http://schemas.microsoft.com/office/word/2010/wordprocessingInk" xmlns:wne="http://schemas.microsoft.com/office/word/2006/wordml" xmlns:wps="http://schemas.microsoft.com/office/word/2010/wordprocessingShape" mc:Ignorable="w14 w15 w16se w16cid w16 w16cex w16sdtdh wp14">
+<w:document xmlns:a="http://schemas.openxmlformats.org/drawingml/2006/main" xmlns:ns1="http://schemas.openxmlformats.org/markup-compatibility/2006" xmlns:ns2="http://schemas.microsoft.com/office/word/2010/wordml" xmlns:ns4="http://schemas.microsoft.com/office/word/2010/wordprocessingDrawing" xmlns:ns8="http://schemas.microsoft.com/office/drawing/2010/main" xmlns:pic="http://schemas.openxmlformats.org/drawingml/2006/picture" xmlns:r="http://schemas.openxmlformats.org/officeDocument/2006/relationships" xmlns:w="http://schemas.openxmlformats.org/wordprocessingml/2006/main" xmlns:wp="http://schemas.openxmlformats.org/drawingml/2006/wordprocessingDrawing" ns1:Ignorable="w14 w15 w16se w16cid w16 w16cex w16sdtdh wp14">
   <w:body>
-    <w:p>
+    <w:p ns2:paraId="1B93100F" ns2:textId="77777777">
       <w:pPr>
         <w:pStyle w:val="Title"/>
       </w:pPr>
@@ -12,16 +12,16 @@
           <w:lang w:eastAsia="zh-CN"/>
         </w:rPr>
         <w:drawing>
-          <wp:inline distT="0" distB="0" distL="0" distR="0" wp14:anchorId="0455B90A" wp14:editId="67A878E4">
+          <wp:inline distT="0" distB="0" distL="0" distR="0" ns4:anchorId="0455B90A" ns4:editId="67A878E4">
             <wp:extent cx="1156566" cy="314325"/>
             <wp:effectExtent l="0" t="0" r="5715" b="0"/>
             <wp:docPr id="2" name="Picture 2" descr="cid:image001.png@01D32FAD.E0890480"/>
             <wp:cNvGraphicFramePr>
-              <a:graphicFrameLocks xmlns:a="http://schemas.openxmlformats.org/drawingml/2006/main" noChangeAspect="1"/>
+              <a:graphicFrameLocks noChangeAspect="1"/>
             </wp:cNvGraphicFramePr>
-            <a:graphic xmlns:a="http://schemas.openxmlformats.org/drawingml/2006/main">
+            <a:graphic>
               <a:graphicData uri="http://schemas.openxmlformats.org/drawingml/2006/picture">
-                <pic:pic xmlns:pic="http://schemas.openxmlformats.org/drawingml/2006/picture">
+                <pic:pic>
                   <pic:nvPicPr>
                     <pic:cNvPr id="0" name="Picture 1" descr="cid:image001.png@01D32FAD.E0890480"/>
                     <pic:cNvPicPr>
@@ -32,7 +32,7 @@
                     <a:blip r:embed="rId8" r:link="rId9">
                       <a:extLst>
                         <a:ext uri="{28A0092B-C50C-407E-A947-70E740481C1C}">
-                          <a14:useLocalDpi xmlns:a14="http://schemas.microsoft.com/office/drawing/2010/main" val="0"/>
+                          <ns8:useLocalDpi val="0"/>
                         </a:ext>
                       </a:extLst>
                     </a:blip>
@@ -61,8 +61,8 @@
         </w:drawing>
       </w:r>
     </w:p>
-    <w:p/>
-    <w:p>
+    <w:p ns2:paraId="73DBDB59" ns2:textId="77777777"/>
+    <w:p ns2:paraId="143866E9" ns2:textId="77777777">
       <w:pPr>
         <w:pStyle w:val="Title"/>
       </w:pPr>
@@ -70,7 +70,7 @@
         <w:t xml:space="preserve">APN Partner Deal Acceleration Program – </w:t>
       </w:r>
     </w:p>
-    <w:p>
+    <w:p ns2:paraId="547AE59C" ns2:textId="7910CA93">
       <w:pPr>
         <w:pStyle w:val="Title"/>
       </w:pPr>
@@ -88,7 +88,7 @@
         <w:t>Project Plan</w:t>
       </w:r>
     </w:p>
-    <w:p>
+    <w:p ns2:paraId="09C76A51" ns2:textId="77777777">
       <w:pPr>
         <w:pStyle w:val="Title"/>
       </w:pPr>
@@ -96,8 +96,8 @@
         <w:t xml:space="preserve"> </w:t>
       </w:r>
     </w:p>
-    <w:p/>
-    <w:p>
+    <w:p ns2:paraId="42465455" ns2:textId="77777777"/>
+    <w:p ns2:paraId="1F1E0F7B" ns2:textId="6D0E350C">
       <w:pPr>
         <w:pStyle w:val="Title"/>
       </w:pPr>
@@ -113,7 +113,7 @@
         <w:t xml:space="preserve"> }}] – [{{ partner }}] – [{{ date }}]</w:t>
       </w:r>
     </w:p>
-    <w:p>
+    <w:p ns2:paraId="5516119B" ns2:textId="77777777">
       <w:pPr>
         <w:rPr>
           <w:rFonts w:asciiTheme="majorHAnsi" w:eastAsiaTheme="majorEastAsia" w:hAnsiTheme="majorHAnsi" w:cstheme="majorBidi"/>
@@ -150,7 +150,7 @@
         </w:rPr>
       </w:sdtEndPr>
       <w:sdtContent>
-        <w:p>
+        <w:p ns2:paraId="5F44A9EA" ns2:textId="77777777">
           <w:pPr>
             <w:pStyle w:val="TOCHeading"/>
           </w:pPr>
@@ -158,7 +158,7 @@
             <w:t>Table of Contents</w:t>
           </w:r>
         </w:p>
-        <w:p>
+        <w:p ns2:paraId="421B9C83" ns2:textId="6720C00E">
           <w:pPr>
             <w:pStyle w:val="TOC1"/>
             <w:tabs>
@@ -290,7 +290,7 @@
             </w:r>
           </w:hyperlink>
         </w:p>
-        <w:p>
+        <w:p ns2:paraId="385026AE" ns2:textId="3BB150B2">
           <w:pPr>
             <w:pStyle w:val="TOC2"/>
             <w:tabs>
@@ -382,7 +382,7 @@
             </w:r>
           </w:hyperlink>
         </w:p>
-        <w:p>
+        <w:p ns2:paraId="75E8B9EC" ns2:textId="08776A06">
           <w:pPr>
             <w:pStyle w:val="TOC2"/>
             <w:tabs>
@@ -474,7 +474,7 @@
             </w:r>
           </w:hyperlink>
         </w:p>
-        <w:p>
+        <w:p ns2:paraId="7C319555" ns2:textId="501D51BB">
           <w:pPr>
             <w:pStyle w:val="TOC2"/>
             <w:tabs>
@@ -566,7 +566,7 @@
             </w:r>
           </w:hyperlink>
         </w:p>
-        <w:p>
+        <w:p ns2:paraId="153ACECC" ns2:textId="777BBE47">
           <w:pPr>
             <w:pStyle w:val="TOC2"/>
             <w:tabs>
@@ -658,7 +658,7 @@
             </w:r>
           </w:hyperlink>
         </w:p>
-        <w:p>
+        <w:p ns2:paraId="3193EA8A" ns2:textId="055F0E1F">
           <w:pPr>
             <w:pStyle w:val="TOC1"/>
             <w:tabs>
@@ -754,7 +754,7 @@
             </w:r>
           </w:hyperlink>
         </w:p>
-        <w:p>
+        <w:p ns2:paraId="12997A8A" ns2:textId="4DDC600A">
           <w:pPr>
             <w:pStyle w:val="TOC1"/>
             <w:tabs>
@@ -850,7 +850,7 @@
             </w:r>
           </w:hyperlink>
         </w:p>
-        <w:p>
+        <w:p ns2:paraId="24FEC1C6" ns2:textId="571EF630">
           <w:pPr>
             <w:pStyle w:val="TOC1"/>
             <w:tabs>
@@ -946,7 +946,7 @@
             </w:r>
           </w:hyperlink>
         </w:p>
-        <w:p>
+        <w:p ns2:paraId="5C5C80E6" ns2:textId="6FAC82E1">
           <w:pPr>
             <w:pStyle w:val="TOC2"/>
             <w:tabs>
@@ -1038,7 +1038,7 @@
             </w:r>
           </w:hyperlink>
         </w:p>
-        <w:p>
+        <w:p ns2:paraId="63C9EBB1" ns2:textId="7DFDC925">
           <w:pPr>
             <w:pStyle w:val="TOC1"/>
             <w:tabs>
@@ -1134,7 +1134,7 @@
             </w:r>
           </w:hyperlink>
         </w:p>
-        <w:p>
+        <w:p ns2:paraId="5463D3F8" ns2:textId="6B1ADEC9">
           <w:pPr>
             <w:pStyle w:val="TOC1"/>
             <w:tabs>
@@ -1230,7 +1230,7 @@
             </w:r>
           </w:hyperlink>
         </w:p>
-        <w:p>
+        <w:p ns2:paraId="3F6A6B9F" ns2:textId="1592F708">
           <w:pPr>
             <w:rPr>
               <w:sz w:val="24"/>
@@ -1252,7 +1252,7 @@
         </w:p>
       </w:sdtContent>
     </w:sdt>
-    <w:p>
+    <w:p ns2:paraId="70AF95BD" ns2:textId="77777777">
       <w:pPr>
         <w:rPr>
           <w:rFonts w:asciiTheme="majorHAnsi" w:eastAsiaTheme="majorEastAsia" w:hAnsiTheme="majorHAnsi" w:cstheme="majorBidi"/>
@@ -1263,7 +1263,7 @@
         <w:br w:type="page"/>
       </w:r>
     </w:p>
-    <w:p>
+    <w:p ns2:paraId="1B1071D8" ns2:textId="77777777">
       <w:pPr>
         <w:pStyle w:val="Heading1"/>
       </w:pPr>
@@ -1274,7 +1274,7 @@
       </w:r>
       <w:bookmarkEnd w:id="0"/>
     </w:p>
-    <w:p>
+    <w:p ns2:paraId="60EC1A72" ns2:textId="77777777">
       <w:pPr>
         <w:pStyle w:val="Heading2"/>
       </w:pPr>
@@ -1284,12 +1284,12 @@
       </w:r>
       <w:bookmarkEnd w:id="1"/>
     </w:p>
-    <w:p>
+    <w:p ns2:paraId="5CBF8358" ns2:textId="1515548B">
       <w:r>
         <w:t>{%p if customer_intro %}</w:t>
       </w:r>
     </w:p>
-    <w:p>
+    <w:p ns2:paraId="24E7C622" ns2:textId="77777777">
       <w:pPr>
         <w:rPr>
           <w:rStyle w:val="Strong"/>
@@ -1302,22 +1302,22 @@
         <w:t>Who is the customer?</w:t>
       </w:r>
     </w:p>
-    <w:p>
+    <w:p ns2:paraId="6AA8C643" ns2:textId="77777777">
       <w:r>
         <w:t>{{ customer_intro }}</w:t>
       </w:r>
     </w:p>
-    <w:p>
+    <w:p ns2:paraId="67CAF638" ns2:textId="77777777">
       <w:r>
         <w:t>{%p endif %}</w:t>
       </w:r>
     </w:p>
-    <w:p>
+    <w:p ns2:paraId="7054A22D" ns2:textId="77777777">
       <w:r>
         <w:t>{%p if problem_statement %}</w:t>
       </w:r>
     </w:p>
-    <w:p>
+    <w:p ns2:paraId="79DE7E66" ns2:textId="77777777">
       <w:pPr>
         <w:rPr>
           <w:rStyle w:val="Strong"/>
@@ -1330,22 +1330,22 @@
         <w:t>What are the problems that the customer is facing?</w:t>
       </w:r>
     </w:p>
-    <w:p>
+    <w:p ns2:paraId="67A3F82D" ns2:textId="77777777">
       <w:r>
         <w:t>{{ problem_statement }}</w:t>
       </w:r>
     </w:p>
-    <w:p>
+    <w:p ns2:paraId="1874D08F" ns2:textId="77777777">
       <w:r>
         <w:t>{%p endif %}</w:t>
       </w:r>
     </w:p>
-    <w:p>
+    <w:p ns2:paraId="5471BB3D" ns2:textId="77777777">
       <w:r>
         <w:t>{%p if proposed_solution %}</w:t>
       </w:r>
     </w:p>
-    <w:p>
+    <w:p ns2:paraId="2A290354" ns2:textId="77777777">
       <w:pPr>
         <w:rPr>
           <w:rStyle w:val="Strong"/>
@@ -1358,22 +1358,22 @@
         <w:t>How will the project be carried out? What is the approach? How many phases there are?</w:t>
       </w:r>
     </w:p>
-    <w:p>
+    <w:p ns2:paraId="02718423" ns2:textId="77777777">
       <w:r>
         <w:t>{{ proposed_solution }}</w:t>
       </w:r>
     </w:p>
-    <w:p>
+    <w:p ns2:paraId="57E6E54A" ns2:textId="77777777">
       <w:r>
         <w:t>{%p endif %}</w:t>
       </w:r>
     </w:p>
-    <w:p>
+    <w:p ns2:paraId="4FF73907" ns2:textId="77777777">
       <w:r>
         <w:t>{%p for phase in phases_overview %}</w:t>
       </w:r>
     </w:p>
-    <w:p>
+    <w:p ns2:paraId="5A5396A9" ns2:textId="77777777">
       <w:pPr>
         <w:pStyle w:val="ListParagraph"/>
         <w:numPr>
@@ -1385,48 +1385,17 @@
         <w:t>{{ phase }}</w:t>
       </w:r>
     </w:p>
-    <w:p>
+    <w:p ns2:paraId="53C7B86C" ns2:textId="77777777">
       <w:r>
         <w:t>{%p endfor %}</w:t>
       </w:r>
     </w:p>
-    <w:p>
-      <w:r>
-        <w:t>{%p if not customer_intro and not problem_statement and not proposed_solution %}</w:t>
-      </w:r>
-    </w:p>
-    <w:p>
-      <w:pPr>
-        <w:rPr>
-          <w:iCs/>
-        </w:rPr>
-      </w:pPr>
-      <w:proofErr w:type="gramStart"/>
-      <w:r>
-        <w:rPr>
-          <w:iCs/>
-        </w:rPr>
-        <w:t>{{ executive</w:t>
-      </w:r>
-      <w:proofErr w:type="gramEnd"/>
-      <w:r>
-        <w:rPr>
-          <w:iCs/>
-        </w:rPr>
-        <w:t>_summary }}</w:t>
-      </w:r>
-    </w:p>
-    <w:p>
-      <w:r>
-        <w:t>{%p endif %}</w:t>
-      </w:r>
-    </w:p>
-    <w:p>
+    <w:p ns2:paraId="10504FA1" ns2:textId="77777777">
       <w:r>
         <w:t>{%p if current_pain_points %}</w:t>
       </w:r>
     </w:p>
-    <w:p>
+    <w:p ns2:paraId="740B8B15" ns2:textId="77777777">
       <w:pPr>
         <w:pStyle w:val="Heading3"/>
         <w:numPr>
@@ -1438,17 +1407,17 @@
         <w:t>Current Pain Points</w:t>
       </w:r>
     </w:p>
-    <w:p>
+    <w:p ns2:paraId="79E39C49" ns2:textId="77777777">
       <w:r>
         <w:t>{%p endif %}</w:t>
       </w:r>
     </w:p>
-    <w:p>
+    <w:p ns2:paraId="2BEF9FDF" ns2:textId="77777777">
       <w:r>
         <w:t>{%p for item in current_pain_points %}</w:t>
       </w:r>
     </w:p>
-    <w:p>
+    <w:p ns2:paraId="22D4F186" ns2:textId="77777777">
       <w:pPr>
         <w:pStyle w:val="ListParagraph"/>
         <w:numPr>
@@ -1460,17 +1429,17 @@
         <w:t>{{ item }}</w:t>
       </w:r>
     </w:p>
-    <w:p>
+    <w:p ns2:paraId="5E426E68" ns2:textId="77777777">
       <w:r>
         <w:t>{%p endfor %}</w:t>
       </w:r>
     </w:p>
-    <w:p>
+    <w:p ns2:paraId="3592659F" ns2:textId="77777777">
       <w:r>
         <w:t>{%p if poc_objectives %}</w:t>
       </w:r>
     </w:p>
-    <w:p>
+    <w:p ns2:paraId="4C51566F" ns2:textId="77777777">
       <w:pPr>
         <w:pStyle w:val="Heading3"/>
         <w:numPr>
@@ -1482,17 +1451,17 @@
         <w:t>PoC Objectives</w:t>
       </w:r>
     </w:p>
-    <w:p>
+    <w:p ns2:paraId="676DB9B6" ns2:textId="77777777">
       <w:r>
         <w:t>{%p endif %}</w:t>
       </w:r>
     </w:p>
-    <w:p>
+    <w:p ns2:paraId="777A6FB4" ns2:textId="77777777">
       <w:r>
         <w:t>{%p for item in poc_objectives %}</w:t>
       </w:r>
     </w:p>
-    <w:p>
+    <w:p ns2:paraId="2F1C3E82" ns2:textId="77777777">
       <w:pPr>
         <w:pStyle w:val="ListParagraph"/>
         <w:numPr>
@@ -1505,17 +1474,17 @@
         <w:t>{{ item }}</w:t>
       </w:r>
     </w:p>
-    <w:p>
+    <w:p ns2:paraId="6996CD47" ns2:textId="77777777">
       <w:r>
         <w:t>{%p endfor %}</w:t>
       </w:r>
     </w:p>
-    <w:p>
+    <w:p ns2:paraId="594E04A4" ns2:textId="77777777">
       <w:r>
         <w:t>{%p if business_case_problem or business_case_roi or business_case_sponsor or business_case_commitment %}</w:t>
       </w:r>
     </w:p>
-    <w:p>
+    <w:p ns2:paraId="2114FE57" ns2:textId="77777777">
       <w:pPr>
         <w:pStyle w:val="Heading3"/>
         <w:numPr>
@@ -1527,7 +1496,7 @@
         <w:t>Business Case</w:t>
       </w:r>
     </w:p>
-    <w:p>
+    <w:p ns2:paraId="3D6E25A0" ns2:textId="77777777">
       <w:pPr>
         <w:pStyle w:val="ListParagraph"/>
         <w:numPr>
@@ -1545,7 +1514,7 @@
         <w:t>{{ business_case_problem }}</w:t>
       </w:r>
     </w:p>
-    <w:p>
+    <w:p ns2:paraId="45A632AE" ns2:textId="77777777">
       <w:pPr>
         <w:pStyle w:val="ListParagraph"/>
         <w:numPr>
@@ -1563,7 +1532,7 @@
         <w:t>{{ business_case_roi }}</w:t>
       </w:r>
     </w:p>
-    <w:p>
+    <w:p ns2:paraId="13F328F6" ns2:textId="77777777">
       <w:pPr>
         <w:pStyle w:val="ListParagraph"/>
         <w:numPr>
@@ -1581,7 +1550,7 @@
         <w:t>{{ business_case_sponsor }}</w:t>
       </w:r>
     </w:p>
-    <w:p>
+    <w:p ns2:paraId="7277207C" ns2:textId="77777777">
       <w:pPr>
         <w:pStyle w:val="ListParagraph"/>
         <w:numPr>
@@ -1599,17 +1568,17 @@
         <w:t>{{ business_case_commitment }}</w:t>
       </w:r>
     </w:p>
-    <w:p>
+    <w:p ns2:paraId="5F261AF3" ns2:textId="77777777">
       <w:r>
         <w:t>{%p endif %}</w:t>
       </w:r>
     </w:p>
-    <w:p>
+    <w:p ns2:paraId="53E4B750" ns2:textId="77777777">
       <w:r>
         <w:t>{%p for block in custom_blocks %}</w:t>
       </w:r>
     </w:p>
-    <w:p>
+    <w:p ns2:paraId="08596C81" ns2:textId="77777777">
       <w:pPr>
         <w:pStyle w:val="Heading3"/>
         <w:numPr>
@@ -1621,17 +1590,17 @@
         <w:t>{{ block.heading }}</w:t>
       </w:r>
     </w:p>
-    <w:p>
+    <w:p ns2:paraId="69A44EAD" ns2:textId="77777777">
       <w:r>
         <w:t>{{ block.content }}</w:t>
       </w:r>
     </w:p>
-    <w:p>
+    <w:p ns2:paraId="5F6B3D6E" ns2:textId="77777777">
       <w:r>
         <w:t>{%p for item in block.bullets %}</w:t>
       </w:r>
     </w:p>
-    <w:p>
+    <w:p ns2:paraId="30208518" ns2:textId="77777777">
       <w:pPr>
         <w:pStyle w:val="ListParagraph"/>
         <w:numPr>
@@ -1643,17 +1612,17 @@
         <w:t>{{ item }}</w:t>
       </w:r>
     </w:p>
-    <w:p>
+    <w:p ns2:paraId="6A9EC547" ns2:textId="77777777">
       <w:r>
         <w:t>{%p endfor %}</w:t>
       </w:r>
     </w:p>
-    <w:p>
+    <w:p ns2:paraId="680333A5" ns2:textId="77777777">
       <w:r>
         <w:t>{%p endfor %}</w:t>
       </w:r>
     </w:p>
-    <w:p>
+    <w:p ns2:paraId="07FB6626" ns2:textId="77777777">
       <w:pPr>
         <w:rPr>
           <w:b/>
@@ -1663,7 +1632,7 @@
         </w:rPr>
       </w:pPr>
     </w:p>
-    <w:p>
+    <w:p ns2:paraId="468A1A29" ns2:textId="77777777">
       <w:pPr>
         <w:pStyle w:val="Heading2"/>
       </w:pPr>
@@ -1673,7 +1642,7 @@
       </w:r>
       <w:bookmarkEnd w:id="2"/>
     </w:p>
-    <w:p>
+    <w:p ns2:paraId="0132A4A9" ns2:textId="77777777">
       <w:pPr>
         <w:rPr>
           <w:rStyle w:val="Strong"/>
@@ -1698,13 +1667,13 @@
         <w:gridCol w:w="3240"/>
         <w:gridCol w:w="2790"/>
       </w:tblGrid>
-      <w:tr>
+      <w:tr ns2:paraId="0BBCC408" ns2:textId="77777777">
         <w:tc>
           <w:tcPr>
             <w:tcW w:w="2065" w:type="dxa"/>
             <w:shd w:val="clear" w:color="auto" w:fill="E7E6E6" w:themeFill="background2"/>
           </w:tcPr>
-          <w:p>
+          <w:p ns2:paraId="0EE3A49D" ns2:textId="77777777">
             <w:r>
               <w:t>Name</w:t>
             </w:r>
@@ -1715,7 +1684,7 @@
             <w:tcW w:w="2340" w:type="dxa"/>
             <w:shd w:val="clear" w:color="auto" w:fill="E7E6E6" w:themeFill="background2"/>
           </w:tcPr>
-          <w:p>
+          <w:p ns2:paraId="4E2EDDDF" ns2:textId="77777777">
             <w:r>
               <w:t>Title</w:t>
             </w:r>
@@ -1726,7 +1695,7 @@
             <w:tcW w:w="3240" w:type="dxa"/>
             <w:shd w:val="clear" w:color="auto" w:fill="E7E6E6" w:themeFill="background2"/>
           </w:tcPr>
-          <w:p>
+          <w:p ns2:paraId="77029A40" ns2:textId="77777777">
             <w:r>
               <w:t>Description</w:t>
             </w:r>
@@ -1737,19 +1706,19 @@
             <w:tcW w:w="2790" w:type="dxa"/>
             <w:shd w:val="clear" w:color="auto" w:fill="E7E6E6" w:themeFill="background2"/>
           </w:tcPr>
-          <w:p>
+          <w:p ns2:paraId="39E47080" ns2:textId="77777777">
             <w:r>
               <w:t>Email / Contact Info</w:t>
             </w:r>
           </w:p>
         </w:tc>
       </w:tr>
-      <w:tr>
+      <w:tr ns2:paraId="52E546F4" ns2:textId="77777777">
         <w:tc>
           <w:tcPr>
             <w:tcW w:w="2065" w:type="dxa"/>
           </w:tcPr>
-          <w:p>
+          <w:p ns2:paraId="63B91F1A" ns2:textId="77777777">
             <w:r>
               <w:t>{%tr for row in executive_sponsors %}</w:t>
             </w:r>
@@ -1759,27 +1728,27 @@
           <w:tcPr>
             <w:tcW w:w="2340" w:type="dxa"/>
           </w:tcPr>
-          <w:p/>
+          <w:p ns2:paraId="4FEB0B20" ns2:textId="77777777"/>
         </w:tc>
         <w:tc>
           <w:tcPr>
             <w:tcW w:w="3240" w:type="dxa"/>
           </w:tcPr>
-          <w:p/>
+          <w:p ns2:paraId="0716ACEF" ns2:textId="77777777"/>
         </w:tc>
         <w:tc>
           <w:tcPr>
             <w:tcW w:w="2790" w:type="dxa"/>
           </w:tcPr>
-          <w:p/>
+          <w:p ns2:paraId="0BF50C4B" ns2:textId="77777777"/>
         </w:tc>
       </w:tr>
-      <w:tr>
+      <w:tr ns2:paraId="306094C4" ns2:textId="77777777">
         <w:tc>
           <w:tcPr>
             <w:tcW w:w="2065" w:type="dxa"/>
           </w:tcPr>
-          <w:p>
+          <w:p ns2:paraId="5DE12EA3" ns2:textId="77777777">
             <w:r>
               <w:t>{{ row.name }}</w:t>
             </w:r>
@@ -1789,7 +1758,7 @@
           <w:tcPr>
             <w:tcW w:w="2340" w:type="dxa"/>
           </w:tcPr>
-          <w:p>
+          <w:p ns2:paraId="22C6FA0F" ns2:textId="77777777">
             <w:r>
               <w:t>{{ row.title }}</w:t>
             </w:r>
@@ -1799,7 +1768,7 @@
           <w:tcPr>
             <w:tcW w:w="3240" w:type="dxa"/>
           </w:tcPr>
-          <w:p>
+          <w:p ns2:paraId="4673D8EE" ns2:textId="77777777">
             <w:r>
               <w:t>{{ row.description }}</w:t>
             </w:r>
@@ -1809,19 +1778,19 @@
           <w:tcPr>
             <w:tcW w:w="2790" w:type="dxa"/>
           </w:tcPr>
-          <w:p>
+          <w:p ns2:paraId="6556073D" ns2:textId="77777777">
             <w:r>
               <w:t>{{ row.contact }}</w:t>
             </w:r>
           </w:p>
         </w:tc>
       </w:tr>
-      <w:tr>
+      <w:tr ns2:paraId="1010B231" ns2:textId="77777777">
         <w:tc>
           <w:tcPr>
             <w:tcW w:w="2065" w:type="dxa"/>
           </w:tcPr>
-          <w:p>
+          <w:p ns2:paraId="0437E25F" ns2:textId="77777777">
             <w:r>
               <w:t>{%tr endfor %}</w:t>
             </w:r>
@@ -1831,23 +1800,23 @@
           <w:tcPr>
             <w:tcW w:w="2340" w:type="dxa"/>
           </w:tcPr>
-          <w:p/>
+          <w:p ns2:paraId="6EF40EB5" ns2:textId="77777777"/>
         </w:tc>
         <w:tc>
           <w:tcPr>
             <w:tcW w:w="3240" w:type="dxa"/>
           </w:tcPr>
-          <w:p/>
+          <w:p ns2:paraId="23E51870" ns2:textId="77777777"/>
         </w:tc>
         <w:tc>
           <w:tcPr>
             <w:tcW w:w="2790" w:type="dxa"/>
           </w:tcPr>
-          <w:p/>
+          <w:p ns2:paraId="26E73CB5" ns2:textId="77777777"/>
         </w:tc>
       </w:tr>
     </w:tbl>
-    <w:p>
+    <w:p ns2:paraId="655B858B" ns2:textId="77777777">
       <w:pPr>
         <w:spacing w:before="240"/>
         <w:rPr>
@@ -1873,13 +1842,13 @@
         <w:gridCol w:w="3240"/>
         <w:gridCol w:w="2790"/>
       </w:tblGrid>
-      <w:tr>
+      <w:tr ns2:paraId="56A804CC" ns2:textId="77777777">
         <w:tc>
           <w:tcPr>
             <w:tcW w:w="2065" w:type="dxa"/>
             <w:shd w:val="clear" w:color="auto" w:fill="E7E6E6" w:themeFill="background2"/>
           </w:tcPr>
-          <w:p>
+          <w:p ns2:paraId="031F239B" ns2:textId="77777777">
             <w:r>
               <w:t>Name</w:t>
             </w:r>
@@ -1890,7 +1859,7 @@
             <w:tcW w:w="2340" w:type="dxa"/>
             <w:shd w:val="clear" w:color="auto" w:fill="E7E6E6" w:themeFill="background2"/>
           </w:tcPr>
-          <w:p>
+          <w:p ns2:paraId="5CA59952" ns2:textId="77777777">
             <w:r>
               <w:t>Title</w:t>
             </w:r>
@@ -1901,7 +1870,7 @@
             <w:tcW w:w="3240" w:type="dxa"/>
             <w:shd w:val="clear" w:color="auto" w:fill="E7E6E6" w:themeFill="background2"/>
           </w:tcPr>
-          <w:p>
+          <w:p ns2:paraId="57F7B87B" ns2:textId="77777777">
             <w:r>
               <w:t>Stakeholder for</w:t>
             </w:r>
@@ -1912,19 +1881,19 @@
             <w:tcW w:w="2790" w:type="dxa"/>
             <w:shd w:val="clear" w:color="auto" w:fill="E7E6E6" w:themeFill="background2"/>
           </w:tcPr>
-          <w:p>
+          <w:p ns2:paraId="556D216C" ns2:textId="77777777">
             <w:r>
               <w:t>Email / Contact Info</w:t>
             </w:r>
           </w:p>
         </w:tc>
       </w:tr>
-      <w:tr>
+      <w:tr ns2:paraId="207F22BA" ns2:textId="77777777">
         <w:tc>
           <w:tcPr>
             <w:tcW w:w="2065" w:type="dxa"/>
           </w:tcPr>
-          <w:p>
+          <w:p ns2:paraId="06CCFAC7" ns2:textId="77777777">
             <w:r>
               <w:t>{%tr for row in stakeholders %}</w:t>
             </w:r>
@@ -1934,27 +1903,27 @@
           <w:tcPr>
             <w:tcW w:w="2340" w:type="dxa"/>
           </w:tcPr>
-          <w:p/>
+          <w:p ns2:paraId="00BD50A8" ns2:textId="77777777"/>
         </w:tc>
         <w:tc>
           <w:tcPr>
             <w:tcW w:w="3240" w:type="dxa"/>
           </w:tcPr>
-          <w:p/>
+          <w:p ns2:paraId="79CBDE85" ns2:textId="77777777"/>
         </w:tc>
         <w:tc>
           <w:tcPr>
             <w:tcW w:w="2790" w:type="dxa"/>
           </w:tcPr>
-          <w:p/>
+          <w:p ns2:paraId="1D249BF1" ns2:textId="77777777"/>
         </w:tc>
       </w:tr>
-      <w:tr>
+      <w:tr ns2:paraId="1065A5BD" ns2:textId="77777777">
         <w:tc>
           <w:tcPr>
             <w:tcW w:w="2065" w:type="dxa"/>
           </w:tcPr>
-          <w:p>
+          <w:p ns2:paraId="6B90AB62" ns2:textId="77777777">
             <w:r>
               <w:t>{{ row.name }}</w:t>
             </w:r>
@@ -1964,7 +1933,7 @@
           <w:tcPr>
             <w:tcW w:w="2340" w:type="dxa"/>
           </w:tcPr>
-          <w:p>
+          <w:p ns2:paraId="280BC78A" ns2:textId="77777777">
             <w:r>
               <w:t>{{ row.title }}</w:t>
             </w:r>
@@ -1974,7 +1943,7 @@
           <w:tcPr>
             <w:tcW w:w="3240" w:type="dxa"/>
           </w:tcPr>
-          <w:p>
+          <w:p ns2:paraId="66F2B333" ns2:textId="77777777">
             <w:r>
               <w:t>{{ row.stakeholder_for }}</w:t>
             </w:r>
@@ -1984,19 +1953,19 @@
           <w:tcPr>
             <w:tcW w:w="2790" w:type="dxa"/>
           </w:tcPr>
-          <w:p>
+          <w:p ns2:paraId="07D1A2F7" ns2:textId="77777777">
             <w:r>
               <w:t>{{ row.contact }}</w:t>
             </w:r>
           </w:p>
         </w:tc>
       </w:tr>
-      <w:tr>
+      <w:tr ns2:paraId="467FEB70" ns2:textId="77777777">
         <w:tc>
           <w:tcPr>
             <w:tcW w:w="2065" w:type="dxa"/>
           </w:tcPr>
-          <w:p>
+          <w:p ns2:paraId="26940C7E" ns2:textId="77777777">
             <w:r>
               <w:t>{%tr endfor %}</w:t>
             </w:r>
@@ -2006,23 +1975,23 @@
           <w:tcPr>
             <w:tcW w:w="2340" w:type="dxa"/>
           </w:tcPr>
-          <w:p/>
+          <w:p ns2:paraId="18B00688" ns2:textId="77777777"/>
         </w:tc>
         <w:tc>
           <w:tcPr>
             <w:tcW w:w="3240" w:type="dxa"/>
           </w:tcPr>
-          <w:p/>
+          <w:p ns2:paraId="33F75132" ns2:textId="77777777"/>
         </w:tc>
         <w:tc>
           <w:tcPr>
             <w:tcW w:w="2790" w:type="dxa"/>
           </w:tcPr>
-          <w:p/>
+          <w:p ns2:paraId="31F2B113" ns2:textId="77777777"/>
         </w:tc>
       </w:tr>
     </w:tbl>
-    <w:p>
+    <w:p ns2:paraId="68FE8EB2" ns2:textId="77777777">
       <w:pPr>
         <w:spacing w:before="240"/>
         <w:rPr>
@@ -2048,13 +2017,13 @@
         <w:gridCol w:w="3240"/>
         <w:gridCol w:w="2790"/>
       </w:tblGrid>
-      <w:tr>
+      <w:tr ns2:paraId="0D4BB895" ns2:textId="77777777">
         <w:tc>
           <w:tcPr>
             <w:tcW w:w="2065" w:type="dxa"/>
             <w:shd w:val="clear" w:color="auto" w:fill="E7E6E6" w:themeFill="background2"/>
           </w:tcPr>
-          <w:p>
+          <w:p ns2:paraId="08B52832" ns2:textId="77777777">
             <w:r>
               <w:t>Name</w:t>
             </w:r>
@@ -2065,7 +2034,7 @@
             <w:tcW w:w="2340" w:type="dxa"/>
             <w:shd w:val="clear" w:color="auto" w:fill="E7E6E6" w:themeFill="background2"/>
           </w:tcPr>
-          <w:p>
+          <w:p ns2:paraId="28D3BE5D" ns2:textId="77777777">
             <w:r>
               <w:t>Title</w:t>
             </w:r>
@@ -2076,7 +2045,7 @@
             <w:tcW w:w="3240" w:type="dxa"/>
             <w:shd w:val="clear" w:color="auto" w:fill="E7E6E6" w:themeFill="background2"/>
           </w:tcPr>
-          <w:p>
+          <w:p ns2:paraId="5E3AB21A" ns2:textId="77777777">
             <w:r>
               <w:t>Role</w:t>
             </w:r>
@@ -2087,19 +2056,19 @@
             <w:tcW w:w="2790" w:type="dxa"/>
             <w:shd w:val="clear" w:color="auto" w:fill="E7E6E6" w:themeFill="background2"/>
           </w:tcPr>
-          <w:p>
+          <w:p ns2:paraId="0CCF71C1" ns2:textId="77777777">
             <w:r>
               <w:t>Email / Contact Info</w:t>
             </w:r>
           </w:p>
         </w:tc>
       </w:tr>
-      <w:tr>
+      <w:tr ns2:paraId="24B571D5" ns2:textId="77777777">
         <w:tc>
           <w:tcPr>
             <w:tcW w:w="2065" w:type="dxa"/>
           </w:tcPr>
-          <w:p>
+          <w:p ns2:paraId="2CF4D9D6" ns2:textId="77777777">
             <w:r>
               <w:t>{%tr for row in project_team %}</w:t>
             </w:r>
@@ -2109,27 +2078,27 @@
           <w:tcPr>
             <w:tcW w:w="2340" w:type="dxa"/>
           </w:tcPr>
-          <w:p/>
+          <w:p ns2:paraId="4855B8F0" ns2:textId="77777777"/>
         </w:tc>
         <w:tc>
           <w:tcPr>
             <w:tcW w:w="3240" w:type="dxa"/>
           </w:tcPr>
-          <w:p/>
+          <w:p ns2:paraId="1BA4B2FF" ns2:textId="77777777"/>
         </w:tc>
         <w:tc>
           <w:tcPr>
             <w:tcW w:w="2790" w:type="dxa"/>
           </w:tcPr>
-          <w:p/>
+          <w:p ns2:paraId="18739204" ns2:textId="77777777"/>
         </w:tc>
       </w:tr>
-      <w:tr>
+      <w:tr ns2:paraId="0E914C22" ns2:textId="77777777">
         <w:tc>
           <w:tcPr>
             <w:tcW w:w="2065" w:type="dxa"/>
           </w:tcPr>
-          <w:p>
+          <w:p ns2:paraId="3477F0BE" ns2:textId="77777777">
             <w:r>
               <w:t>{{ row.name }}</w:t>
             </w:r>
@@ -2139,7 +2108,7 @@
           <w:tcPr>
             <w:tcW w:w="2340" w:type="dxa"/>
           </w:tcPr>
-          <w:p>
+          <w:p ns2:paraId="785B86AE" ns2:textId="77777777">
             <w:r>
               <w:t>{{ row.title }}</w:t>
             </w:r>
@@ -2149,7 +2118,7 @@
           <w:tcPr>
             <w:tcW w:w="3240" w:type="dxa"/>
           </w:tcPr>
-          <w:p>
+          <w:p ns2:paraId="6A4AC35C" ns2:textId="77777777">
             <w:r>
               <w:t>{{ row.role }}</w:t>
             </w:r>
@@ -2159,19 +2128,19 @@
           <w:tcPr>
             <w:tcW w:w="2790" w:type="dxa"/>
           </w:tcPr>
-          <w:p>
+          <w:p ns2:paraId="51358DE4" ns2:textId="77777777">
             <w:r>
               <w:t>{{ row.contact }}</w:t>
             </w:r>
           </w:p>
         </w:tc>
       </w:tr>
-      <w:tr>
+      <w:tr ns2:paraId="49FDC4FC" ns2:textId="77777777">
         <w:tc>
           <w:tcPr>
             <w:tcW w:w="2065" w:type="dxa"/>
           </w:tcPr>
-          <w:p>
+          <w:p ns2:paraId="772261D4" ns2:textId="77777777">
             <w:r>
               <w:t>{%tr endfor %}</w:t>
             </w:r>
@@ -2181,23 +2150,23 @@
           <w:tcPr>
             <w:tcW w:w="2340" w:type="dxa"/>
           </w:tcPr>
-          <w:p/>
+          <w:p ns2:paraId="7D100C08" ns2:textId="77777777"/>
         </w:tc>
         <w:tc>
           <w:tcPr>
             <w:tcW w:w="3240" w:type="dxa"/>
           </w:tcPr>
-          <w:p/>
+          <w:p ns2:paraId="6BAA7F39" ns2:textId="77777777"/>
         </w:tc>
         <w:tc>
           <w:tcPr>
             <w:tcW w:w="2790" w:type="dxa"/>
           </w:tcPr>
-          <w:p/>
+          <w:p ns2:paraId="06DF9257" ns2:textId="77777777"/>
         </w:tc>
       </w:tr>
     </w:tbl>
-    <w:p>
+    <w:p ns2:paraId="76BE5A2E" ns2:textId="4C6EE903">
       <w:pPr>
         <w:spacing w:before="240"/>
         <w:rPr>
@@ -2224,13 +2193,13 @@
         <w:gridCol w:w="3240"/>
         <w:gridCol w:w="2790"/>
       </w:tblGrid>
-      <w:tr>
+      <w:tr ns2:paraId="5D95AFDE" ns2:textId="77777777">
         <w:tc>
           <w:tcPr>
             <w:tcW w:w="2065" w:type="dxa"/>
             <w:shd w:val="clear" w:color="auto" w:fill="E7E6E6" w:themeFill="background2"/>
           </w:tcPr>
-          <w:p>
+          <w:p ns2:paraId="7F968095" ns2:textId="77777777">
             <w:r>
               <w:t>Name</w:t>
             </w:r>
@@ -2241,7 +2210,7 @@
             <w:tcW w:w="2340" w:type="dxa"/>
             <w:shd w:val="clear" w:color="auto" w:fill="E7E6E6" w:themeFill="background2"/>
           </w:tcPr>
-          <w:p>
+          <w:p ns2:paraId="4BCFC74B" ns2:textId="77777777">
             <w:r>
               <w:t>Title</w:t>
             </w:r>
@@ -2252,7 +2221,7 @@
             <w:tcW w:w="3240" w:type="dxa"/>
             <w:shd w:val="clear" w:color="auto" w:fill="E7E6E6" w:themeFill="background2"/>
           </w:tcPr>
-          <w:p>
+          <w:p ns2:paraId="7D1D6920" ns2:textId="77777777">
             <w:r>
               <w:t>Role</w:t>
             </w:r>
@@ -2263,19 +2232,19 @@
             <w:tcW w:w="2790" w:type="dxa"/>
             <w:shd w:val="clear" w:color="auto" w:fill="E7E6E6" w:themeFill="background2"/>
           </w:tcPr>
-          <w:p>
+          <w:p ns2:paraId="6C56EB81" ns2:textId="77777777">
             <w:r>
               <w:t>Email / Contact Info</w:t>
             </w:r>
           </w:p>
         </w:tc>
       </w:tr>
-      <w:tr>
+      <w:tr ns2:paraId="5600595A" ns2:textId="77777777">
         <w:tc>
           <w:tcPr>
             <w:tcW w:w="2065" w:type="dxa"/>
           </w:tcPr>
-          <w:p>
+          <w:p ns2:paraId="5288C92A" ns2:textId="77777777">
             <w:r>
               <w:t>{%tr for row in escalation_contacts %}</w:t>
             </w:r>
@@ -2285,27 +2254,27 @@
           <w:tcPr>
             <w:tcW w:w="2340" w:type="dxa"/>
           </w:tcPr>
-          <w:p/>
+          <w:p ns2:paraId="649A3137" ns2:textId="77777777"/>
         </w:tc>
         <w:tc>
           <w:tcPr>
             <w:tcW w:w="3240" w:type="dxa"/>
           </w:tcPr>
-          <w:p/>
+          <w:p ns2:paraId="0A5EE679" ns2:textId="77777777"/>
         </w:tc>
         <w:tc>
           <w:tcPr>
             <w:tcW w:w="2790" w:type="dxa"/>
           </w:tcPr>
-          <w:p/>
+          <w:p ns2:paraId="75BC5B1D" ns2:textId="77777777"/>
         </w:tc>
       </w:tr>
-      <w:tr>
+      <w:tr ns2:paraId="75975E10" ns2:textId="77777777">
         <w:tc>
           <w:tcPr>
             <w:tcW w:w="2065" w:type="dxa"/>
           </w:tcPr>
-          <w:p>
+          <w:p ns2:paraId="277AC5EC" ns2:textId="77777777">
             <w:r>
               <w:t>{{ row.name }}</w:t>
             </w:r>
@@ -2315,7 +2284,7 @@
           <w:tcPr>
             <w:tcW w:w="2340" w:type="dxa"/>
           </w:tcPr>
-          <w:p>
+          <w:p ns2:paraId="2C07C86D" ns2:textId="77777777">
             <w:r>
               <w:t>{{ row.title }}</w:t>
             </w:r>
@@ -2325,7 +2294,7 @@
           <w:tcPr>
             <w:tcW w:w="3240" w:type="dxa"/>
           </w:tcPr>
-          <w:p>
+          <w:p ns2:paraId="41A0C155" ns2:textId="77777777">
             <w:r>
               <w:t>{{ row.role }}</w:t>
             </w:r>
@@ -2335,19 +2304,19 @@
           <w:tcPr>
             <w:tcW w:w="2790" w:type="dxa"/>
           </w:tcPr>
-          <w:p>
+          <w:p ns2:paraId="4F25BB83" ns2:textId="77777777">
             <w:r>
               <w:t>{{ row.contact }}</w:t>
             </w:r>
           </w:p>
         </w:tc>
       </w:tr>
-      <w:tr>
+      <w:tr ns2:paraId="0AD9757C" ns2:textId="77777777">
         <w:tc>
           <w:tcPr>
             <w:tcW w:w="2065" w:type="dxa"/>
           </w:tcPr>
-          <w:p>
+          <w:p ns2:paraId="4B0084F9" ns2:textId="77777777">
             <w:r>
               <w:t>{%tr endfor %}</w:t>
             </w:r>
@@ -2357,23 +2326,23 @@
           <w:tcPr>
             <w:tcW w:w="2340" w:type="dxa"/>
           </w:tcPr>
-          <w:p/>
+          <w:p ns2:paraId="6DFA135B" ns2:textId="77777777"/>
         </w:tc>
         <w:tc>
           <w:tcPr>
             <w:tcW w:w="3240" w:type="dxa"/>
           </w:tcPr>
-          <w:p/>
+          <w:p ns2:paraId="2DC56E2A" ns2:textId="77777777"/>
         </w:tc>
         <w:tc>
           <w:tcPr>
             <w:tcW w:w="2790" w:type="dxa"/>
           </w:tcPr>
-          <w:p/>
+          <w:p ns2:paraId="0A200E83" ns2:textId="77777777"/>
         </w:tc>
       </w:tr>
     </w:tbl>
-    <w:p>
+    <w:p ns2:paraId="63227008" ns2:textId="77777777">
       <w:pPr>
         <w:pStyle w:val="NoSpacing"/>
         <w:tabs>
@@ -2389,7 +2358,7 @@
         </w:rPr>
       </w:pPr>
     </w:p>
-    <w:p>
+    <w:p ns2:paraId="27D0570B" ns2:textId="77777777">
       <w:pPr>
         <w:pStyle w:val="Heading2"/>
       </w:pPr>
@@ -2399,12 +2368,12 @@
       </w:r>
       <w:bookmarkEnd w:id="3"/>
     </w:p>
-    <w:p>
+    <w:p ns2:paraId="7EA80E78" ns2:textId="77777777">
       <w:r>
         <w:t>{%p for group in success_criteria_groups %}</w:t>
       </w:r>
     </w:p>
-    <w:p>
+    <w:p ns2:paraId="537CCADF" ns2:textId="77777777">
       <w:pPr>
         <w:pStyle w:val="Heading3"/>
         <w:numPr>
@@ -2416,12 +2385,12 @@
         <w:t>({{ loop.index }}) {{ group.category_name }}</w:t>
       </w:r>
     </w:p>
-    <w:p>
+    <w:p ns2:paraId="757FA905" ns2:textId="77777777">
       <w:r>
         <w:t>{%p for item in group.bullets %}</w:t>
       </w:r>
     </w:p>
-    <w:p>
+    <w:p ns2:paraId="3D84271E" ns2:textId="77777777">
       <w:pPr>
         <w:pStyle w:val="ListParagraph"/>
         <w:numPr>
@@ -2433,27 +2402,27 @@
         <w:t>{{ item }}</w:t>
       </w:r>
     </w:p>
-    <w:p>
+    <w:p ns2:paraId="11DD7EF2" ns2:textId="77777777">
       <w:r>
         <w:t>{%p endfor %}</w:t>
       </w:r>
     </w:p>
-    <w:p>
+    <w:p ns2:paraId="795BC39B" ns2:textId="77777777">
       <w:r>
         <w:t>{%p endfor %}</w:t>
       </w:r>
     </w:p>
-    <w:p>
+    <w:p ns2:paraId="506C0C44" ns2:textId="77777777">
       <w:r>
         <w:t>{%p if not success_criteria_groups and success_criteria_items %}</w:t>
       </w:r>
     </w:p>
-    <w:p>
+    <w:p ns2:paraId="5C1F6963" ns2:textId="77777777">
       <w:r>
         <w:t>{%p for item in success_criteria_items %}</w:t>
       </w:r>
     </w:p>
-    <w:p>
+    <w:p ns2:paraId="3C1AEF41" ns2:textId="77777777">
       <w:pPr>
         <w:pStyle w:val="ListParagraph"/>
         <w:numPr>
@@ -2465,22 +2434,22 @@
         <w:t>{{ item }}</w:t>
       </w:r>
     </w:p>
-    <w:p>
+    <w:p ns2:paraId="705966DA" ns2:textId="77777777">
       <w:r>
         <w:t>{%p endfor %}</w:t>
       </w:r>
     </w:p>
-    <w:p>
+    <w:p ns2:paraId="30CBBC05" ns2:textId="77777777">
       <w:r>
         <w:t>{%p endif %}</w:t>
       </w:r>
     </w:p>
-    <w:p>
+    <w:p ns2:paraId="12F8EB5A" ns2:textId="77777777">
       <w:r>
         <w:t>{%p if not success_criteria_groups and not success_criteria_items %}</w:t>
       </w:r>
     </w:p>
-    <w:p>
+    <w:p ns2:paraId="7269A5DF" ns2:textId="77777777">
       <w:pPr>
         <w:rPr>
           <w:iCs/>
@@ -2501,13 +2470,13 @@
         <w:t>_criteria }}</w:t>
       </w:r>
     </w:p>
-    <w:p>
+    <w:p ns2:paraId="5A0D5578" ns2:textId="77777777">
       <w:r>
         <w:t>{%p endif %}</w:t>
       </w:r>
     </w:p>
-    <w:p/>
-    <w:p>
+    <w:p ns2:paraId="10400AC2" ns2:textId="77777777"/>
+    <w:p ns2:paraId="03E95D04" ns2:textId="77777777">
       <w:pPr>
         <w:pStyle w:val="Heading2"/>
       </w:pPr>
@@ -2517,12 +2486,12 @@
       </w:r>
       <w:bookmarkEnd w:id="4"/>
     </w:p>
-    <w:p>
+    <w:p ns2:paraId="04DDB31A" ns2:textId="671F703F">
       <w:r>
         <w:t>{%p for group in assumptions_groups %}</w:t>
       </w:r>
     </w:p>
-    <w:p>
+    <w:p ns2:paraId="4C94C75E" ns2:textId="77777777">
       <w:pPr>
         <w:pStyle w:val="Heading3"/>
         <w:numPr>
@@ -2534,12 +2503,12 @@
         <w:t>({{ loop.index }}) {{ group.category_name }}</w:t>
       </w:r>
     </w:p>
-    <w:p>
+    <w:p ns2:paraId="02B134C6" ns2:textId="77777777">
       <w:r>
         <w:t>{%p for item in group.bullets %}</w:t>
       </w:r>
     </w:p>
-    <w:p>
+    <w:p ns2:paraId="63423850" ns2:textId="77777777">
       <w:pPr>
         <w:pStyle w:val="ListParagraph"/>
         <w:numPr>
@@ -2551,27 +2520,27 @@
         <w:t>{{ item }}</w:t>
       </w:r>
     </w:p>
-    <w:p>
+    <w:p ns2:paraId="7E775198" ns2:textId="77777777">
       <w:r>
         <w:t>{%p endfor %}</w:t>
       </w:r>
     </w:p>
-    <w:p>
+    <w:p ns2:paraId="428220B7" ns2:textId="77777777">
       <w:r>
         <w:t>{%p endfor %}</w:t>
       </w:r>
     </w:p>
-    <w:p>
+    <w:p ns2:paraId="152DE6EC" ns2:textId="77777777">
       <w:r>
         <w:t>{%p if not assumptions_groups and assumptions_items %}</w:t>
       </w:r>
     </w:p>
-    <w:p>
+    <w:p ns2:paraId="1D00A86E" ns2:textId="77777777">
       <w:r>
         <w:t>{%p for item in assumptions_items %}</w:t>
       </w:r>
     </w:p>
-    <w:p>
+    <w:p ns2:paraId="3D4A3C62" ns2:textId="77777777">
       <w:pPr>
         <w:pStyle w:val="ListParagraph"/>
         <w:numPr>
@@ -2584,22 +2553,22 @@
         <w:t>{{ item }}</w:t>
       </w:r>
     </w:p>
-    <w:p>
+    <w:p ns2:paraId="63FB4CD2" ns2:textId="77777777">
       <w:r>
         <w:t>{%p endfor %}</w:t>
       </w:r>
     </w:p>
-    <w:p>
+    <w:p ns2:paraId="3ABF1099" ns2:textId="77777777">
       <w:r>
         <w:t>{%p endif %}</w:t>
       </w:r>
     </w:p>
-    <w:p>
+    <w:p ns2:paraId="4EEC7E2B" ns2:textId="77777777">
       <w:r>
         <w:t>{%p if not assumptions_groups and not assumptions_items %}</w:t>
       </w:r>
     </w:p>
-    <w:p>
+    <w:p ns2:paraId="61B1277D" ns2:textId="77777777">
       <w:pPr>
         <w:rPr>
           <w:iCs/>
@@ -2620,12 +2589,12 @@
         <w:t xml:space="preserve"> }}</w:t>
       </w:r>
     </w:p>
-    <w:p>
+    <w:p ns2:paraId="6444C784" ns2:textId="77777777">
       <w:r>
         <w:t>{%p endif %}</w:t>
       </w:r>
     </w:p>
-    <w:p>
+    <w:p ns2:paraId="0DB24DE7" ns2:textId="77777777">
       <w:pPr>
         <w:rPr>
           <w:i/>
@@ -2633,12 +2602,12 @@
         </w:rPr>
       </w:pPr>
     </w:p>
-    <w:p>
+    <w:p ns2:paraId="3DA6FC61" ns2:textId="77777777">
       <w:r>
         <w:br w:type="page"/>
       </w:r>
     </w:p>
-    <w:p>
+    <w:p ns2:paraId="7205B864" ns2:textId="77777777">
       <w:pPr>
         <w:pStyle w:val="Heading1"/>
         <w:rPr>
@@ -2664,13 +2633,13 @@
         <w:gridCol w:w="4060"/>
         <w:gridCol w:w="2235"/>
       </w:tblGrid>
-      <w:tr>
+      <w:tr ns2:paraId="56DA9D7A" ns2:textId="77777777">
         <w:tc>
           <w:tcPr>
             <w:tcW w:w="2070" w:type="dxa"/>
             <w:shd w:val="clear" w:color="auto" w:fill="E7E6E6" w:themeFill="background2"/>
           </w:tcPr>
-          <w:p>
+          <w:p ns2:paraId="4A2CDE85" ns2:textId="77777777">
             <w:r>
               <w:rPr>
                 <w:rStyle w:val="Strong"/>
@@ -2684,7 +2653,7 @@
             <w:tcW w:w="2070" w:type="dxa"/>
             <w:shd w:val="clear" w:color="auto" w:fill="E7E6E6" w:themeFill="background2"/>
           </w:tcPr>
-          <w:p>
+          <w:p ns2:paraId="36616085" ns2:textId="77777777">
             <w:r>
               <w:rPr>
                 <w:rStyle w:val="Strong"/>
@@ -2698,7 +2667,7 @@
             <w:tcW w:w="4060" w:type="dxa"/>
             <w:shd w:val="clear" w:color="auto" w:fill="E7E6E6" w:themeFill="background2"/>
           </w:tcPr>
-          <w:p>
+          <w:p ns2:paraId="50C09DBD" ns2:textId="77777777">
             <w:r>
               <w:rPr>
                 <w:rStyle w:val="Strong"/>
@@ -2712,7 +2681,7 @@
             <w:tcW w:w="2235" w:type="dxa"/>
             <w:shd w:val="clear" w:color="auto" w:fill="E7E6E6" w:themeFill="background2"/>
           </w:tcPr>
-          <w:p>
+          <w:p ns2:paraId="08704A2F" ns2:textId="77777777">
             <w:r>
               <w:rPr>
                 <w:rStyle w:val="Strong"/>
@@ -2722,12 +2691,12 @@
           </w:p>
         </w:tc>
       </w:tr>
-      <w:tr>
+      <w:tr ns2:paraId="281F6C61" ns2:textId="77777777">
         <w:tc>
           <w:tcPr>
             <w:tcW w:w="2070" w:type="dxa"/>
           </w:tcPr>
-          <w:p>
+          <w:p ns2:paraId="1BD83833" ns2:textId="77777777">
             <w:r>
               <w:t>{%tr for task in scope_tasks %}</w:t>
             </w:r>
@@ -2737,27 +2706,27 @@
           <w:tcPr>
             <w:tcW w:w="2070" w:type="dxa"/>
           </w:tcPr>
-          <w:p/>
+          <w:p ns2:paraId="50F0BF10" ns2:textId="77777777"/>
         </w:tc>
         <w:tc>
           <w:tcPr>
             <w:tcW w:w="4060" w:type="dxa"/>
           </w:tcPr>
-          <w:p/>
+          <w:p ns2:paraId="3EDEAE0B" ns2:textId="77777777"/>
         </w:tc>
         <w:tc>
           <w:tcPr>
             <w:tcW w:w="2235" w:type="dxa"/>
           </w:tcPr>
-          <w:p/>
+          <w:p ns2:paraId="7FC79EAE" ns2:textId="77777777"/>
         </w:tc>
       </w:tr>
-      <w:tr>
+      <w:tr ns2:paraId="60D491EF" ns2:textId="77777777">
         <w:tc>
           <w:tcPr>
             <w:tcW w:w="2070" w:type="dxa"/>
           </w:tcPr>
-          <w:p>
+          <w:p ns2:paraId="588D7FC2" ns2:textId="77777777">
             <w:r>
               <w:t>{{ task.task_category }}</w:t>
             </w:r>
@@ -2767,7 +2736,7 @@
           <w:tcPr>
             <w:tcW w:w="2070" w:type="dxa"/>
           </w:tcPr>
-          <w:p>
+          <w:p ns2:paraId="476B09FF" ns2:textId="77777777">
             <w:r>
               <w:t>{{ task.schedule }}</w:t>
             </w:r>
@@ -2777,7 +2746,7 @@
           <w:tcPr>
             <w:tcW w:w="4060" w:type="dxa"/>
           </w:tcPr>
-          <w:p>
+          <w:p ns2:paraId="706B5147" ns2:textId="77777777">
             <w:r>
               <w:t>{{ task.details }}</w:t>
             </w:r>
@@ -2787,19 +2756,19 @@
           <w:tcPr>
             <w:tcW w:w="2235" w:type="dxa"/>
           </w:tcPr>
-          <w:p>
+          <w:p ns2:paraId="601A023C" ns2:textId="77777777">
             <w:r>
               <w:t>{{ task.personnel }}</w:t>
             </w:r>
           </w:p>
         </w:tc>
       </w:tr>
-      <w:tr>
+      <w:tr ns2:paraId="1E7D8889" ns2:textId="77777777">
         <w:tc>
           <w:tcPr>
             <w:tcW w:w="2070" w:type="dxa"/>
           </w:tcPr>
-          <w:p>
+          <w:p ns2:paraId="55EF6B5E" ns2:textId="77777777">
             <w:r>
               <w:t>{%tr endfor %}</w:t>
             </w:r>
@@ -2809,28 +2778,28 @@
           <w:tcPr>
             <w:tcW w:w="2070" w:type="dxa"/>
           </w:tcPr>
-          <w:p/>
+          <w:p ns2:paraId="5CF6E46A" ns2:textId="77777777"/>
         </w:tc>
         <w:tc>
           <w:tcPr>
             <w:tcW w:w="4060" w:type="dxa"/>
           </w:tcPr>
-          <w:p/>
+          <w:p ns2:paraId="06A5AC99" ns2:textId="77777777"/>
         </w:tc>
         <w:tc>
           <w:tcPr>
             <w:tcW w:w="2235" w:type="dxa"/>
           </w:tcPr>
-          <w:p/>
+          <w:p ns2:paraId="1CDB2740" ns2:textId="77777777"/>
         </w:tc>
       </w:tr>
     </w:tbl>
-    <w:p>
+    <w:p ns2:paraId="50EBB1C8" ns2:textId="77777777">
       <w:r>
         <w:t>{%p if scope_out_of_scope %}</w:t>
       </w:r>
     </w:p>
-    <w:p>
+    <w:p ns2:paraId="7D102077" ns2:textId="77777777">
       <w:pPr>
         <w:rPr>
           <w:rStyle w:val="Strong"/>
@@ -2843,17 +2812,17 @@
         <w:t>Out of Scope</w:t>
       </w:r>
     </w:p>
-    <w:p>
+    <w:p ns2:paraId="6EBA7B20" ns2:textId="77777777">
       <w:r>
         <w:t>{%p endif %}</w:t>
       </w:r>
     </w:p>
-    <w:p>
+    <w:p ns2:paraId="03126B3F" ns2:textId="77777777">
       <w:r>
         <w:t>{%p for item in scope_out_of_scope %}</w:t>
       </w:r>
     </w:p>
-    <w:p>
+    <w:p ns2:paraId="74A903A9" ns2:textId="77777777">
       <w:pPr>
         <w:pStyle w:val="ListParagraph"/>
         <w:numPr>
@@ -2865,22 +2834,22 @@
         <w:t>{{ item }}</w:t>
       </w:r>
     </w:p>
-    <w:p>
+    <w:p ns2:paraId="12FE57F2" ns2:textId="77777777">
       <w:r>
         <w:t>{%p endfor %}</w:t>
       </w:r>
     </w:p>
-    <w:p>
+    <w:p ns2:paraId="42809889" ns2:textId="77777777">
       <w:r>
         <w:t>{%p if not scope_tasks and scope_items %}</w:t>
       </w:r>
     </w:p>
-    <w:p>
+    <w:p ns2:paraId="5A688D65" ns2:textId="77777777">
       <w:r>
         <w:t>{%p for item in scope_items %}</w:t>
       </w:r>
     </w:p>
-    <w:p>
+    <w:p ns2:paraId="78053C6C" ns2:textId="77777777">
       <w:pPr>
         <w:pStyle w:val="ListParagraph"/>
         <w:numPr>
@@ -2892,22 +2861,22 @@
         <w:t>{{ item }}</w:t>
       </w:r>
     </w:p>
-    <w:p>
+    <w:p ns2:paraId="7BEBE82D" ns2:textId="77777777">
       <w:r>
         <w:t>{%p endfor %}</w:t>
       </w:r>
     </w:p>
-    <w:p>
+    <w:p ns2:paraId="24370ABF" ns2:textId="77777777">
       <w:r>
         <w:t>{%p endif %}</w:t>
       </w:r>
     </w:p>
-    <w:p>
+    <w:p ns2:paraId="6EA419BA" ns2:textId="77777777">
       <w:r>
         <w:t>{%p if not scope_tasks and not scope_items %}</w:t>
       </w:r>
     </w:p>
-    <w:p>
+    <w:p ns2:paraId="287BD455" ns2:textId="77777777">
       <w:pPr>
         <w:rPr>
           <w:iCs/>
@@ -2928,17 +2897,17 @@
         <w:t>_of_work }}</w:t>
       </w:r>
     </w:p>
-    <w:p>
+    <w:p ns2:paraId="318D79C0" ns2:textId="77777777">
       <w:r>
         <w:t>{%p endif %}</w:t>
       </w:r>
     </w:p>
-    <w:p>
+    <w:p ns2:paraId="21B046AD" ns2:textId="77777777">
       <w:r>
         <w:br w:type="page"/>
       </w:r>
     </w:p>
-    <w:p>
+    <w:p ns2:paraId="029410A6" ns2:textId="77777777">
       <w:pPr>
         <w:pStyle w:val="Heading1"/>
       </w:pPr>
@@ -2949,27 +2918,27 @@
       </w:r>
       <w:bookmarkEnd w:id="6"/>
     </w:p>
-    <w:p>
+    <w:p ns2:paraId="054F73D2" ns2:textId="43368CD3">
       <w:r>
         <w:t>{%p if architecture_overview %}</w:t>
       </w:r>
     </w:p>
-    <w:p>
+    <w:p ns2:paraId="1B848F6C" ns2:textId="77777777">
       <w:r>
         <w:t>{{ architecture_overview }}</w:t>
       </w:r>
     </w:p>
-    <w:p>
+    <w:p ns2:paraId="477EDF73" ns2:textId="77777777">
       <w:r>
         <w:t>{%p endif %}</w:t>
       </w:r>
     </w:p>
-    <w:p>
+    <w:p ns2:paraId="694F27F9" ns2:textId="77777777">
       <w:r>
         <w:t>{%p if architecture_diagram_image %}</w:t>
       </w:r>
     </w:p>
-    <w:p>
+    <w:p ns2:paraId="1CBD7C90" ns2:textId="77777777">
       <w:pPr>
         <w:jc w:val="center"/>
       </w:pPr>
@@ -2977,17 +2946,17 @@
         <w:t>{{ architecture_diagram_image }}</w:t>
       </w:r>
     </w:p>
-    <w:p>
+    <w:p ns2:paraId="2C605284" ns2:textId="77777777">
       <w:r>
         <w:t>{%p endif %}</w:t>
       </w:r>
     </w:p>
-    <w:p>
+    <w:p ns2:paraId="064A6042" ns2:textId="77777777">
       <w:r>
         <w:t>{%p for svc in architecture_services %}</w:t>
       </w:r>
     </w:p>
-    <w:p>
+    <w:p ns2:paraId="6E5B7055" ns2:textId="77777777">
       <w:pPr>
         <w:pStyle w:val="Heading3"/>
         <w:numPr>
@@ -2999,37 +2968,37 @@
         <w:t>{{ svc.service_name }}</w:t>
       </w:r>
     </w:p>
-    <w:p>
+    <w:p ns2:paraId="44F15B19" ns2:textId="77777777">
       <w:r>
         <w:t>{{ svc.description }}</w:t>
       </w:r>
     </w:p>
-    <w:p>
+    <w:p ns2:paraId="7A40AF69" ns2:textId="77777777">
       <w:r>
         <w:t>{%p if svc.sizing_rationale %}</w:t>
       </w:r>
     </w:p>
-    <w:p>
+    <w:p ns2:paraId="1E964D7A" ns2:textId="77777777">
       <w:r>
         <w:t>{{ svc.sizing_rationale }}</w:t>
       </w:r>
     </w:p>
-    <w:p>
+    <w:p ns2:paraId="0726FE64" ns2:textId="77777777">
       <w:r>
         <w:t>{%p endif %}</w:t>
       </w:r>
     </w:p>
-    <w:p>
+    <w:p ns2:paraId="7DF9F739" ns2:textId="77777777">
       <w:r>
         <w:t>{%p endfor %}</w:t>
       </w:r>
     </w:p>
-    <w:p>
+    <w:p ns2:paraId="798E4F0C" ns2:textId="77777777">
       <w:r>
         <w:t>{%p if architecture_tools_list %}</w:t>
       </w:r>
     </w:p>
-    <w:p>
+    <w:p ns2:paraId="637B7D9D" ns2:textId="77777777">
       <w:pPr>
         <w:rPr>
           <w:rStyle w:val="Strong"/>
@@ -3042,17 +3011,17 @@
         <w:t>Tools</w:t>
       </w:r>
     </w:p>
-    <w:p>
+    <w:p ns2:paraId="138ECC6D" ns2:textId="77777777">
       <w:r>
         <w:t>{%p endif %}</w:t>
       </w:r>
     </w:p>
-    <w:p>
+    <w:p ns2:paraId="684523A6" ns2:textId="77777777">
       <w:r>
         <w:t>{%p for tool in architecture_tools_list %}</w:t>
       </w:r>
     </w:p>
-    <w:p>
+    <w:p ns2:paraId="3F757E08" ns2:textId="77777777">
       <w:pPr>
         <w:pStyle w:val="ListParagraph"/>
         <w:numPr>
@@ -3064,17 +3033,17 @@
         <w:t>{{ tool }}</w:t>
       </w:r>
     </w:p>
-    <w:p>
+    <w:p ns2:paraId="1970D3DF" ns2:textId="77777777">
       <w:r>
         <w:t>{%p endfor %}</w:t>
       </w:r>
     </w:p>
-    <w:p>
+    <w:p ns2:paraId="187CD91F" ns2:textId="77777777">
       <w:r>
         <w:t>{%p if not architecture_services and architecture_description %}</w:t>
       </w:r>
     </w:p>
-    <w:p>
+    <w:p ns2:paraId="08A23C34" ns2:textId="77777777">
       <w:pPr>
         <w:rPr>
           <w:iCs/>
@@ -3095,7 +3064,7 @@
         <w:t>_description }}</w:t>
       </w:r>
     </w:p>
-    <w:p>
+    <w:p ns2:paraId="52EC445F" ns2:textId="77777777">
       <w:proofErr w:type="gramStart"/>
       <w:r>
         <w:t>{{ architecture</w:t>
@@ -3105,18 +3074,18 @@
         <w:t>_tools }}</w:t>
       </w:r>
     </w:p>
-    <w:p>
+    <w:p ns2:paraId="4D07D42A" ns2:textId="77777777">
       <w:r>
         <w:t>{%p endif %}</w:t>
       </w:r>
     </w:p>
-    <w:p/>
-    <w:p>
+    <w:p ns2:paraId="26E92881" ns2:textId="77777777"/>
+    <w:p ns2:paraId="59C3962F" ns2:textId="3C21FF86">
       <w:r>
         <w:br w:type="page"/>
       </w:r>
     </w:p>
-    <w:p>
+    <w:p ns2:paraId="3F656131" ns2:textId="77777777">
       <w:pPr>
         <w:pStyle w:val="Heading1"/>
       </w:pPr>
@@ -3138,14 +3107,14 @@
         <w:gridCol w:w="2354"/>
         <w:gridCol w:w="6744"/>
       </w:tblGrid>
-      <w:tr>
+      <w:tr ns2:paraId="26BB3CBD" ns2:textId="77777777">
         <w:tc>
           <w:tcPr>
             <w:tcW w:w="1705" w:type="dxa"/>
             <w:shd w:val="clear" w:color="auto" w:fill="D9D9D9" w:themeFill="background1" w:themeFillShade="D9"/>
             <w:vAlign w:val="center"/>
           </w:tcPr>
-          <w:p>
+          <w:p ns2:paraId="6CB8751D" ns2:textId="77777777">
             <w:pPr>
               <w:jc w:val="center"/>
               <w:rPr>
@@ -3166,7 +3135,7 @@
             <w:shd w:val="clear" w:color="auto" w:fill="D9D9D9" w:themeFill="background1" w:themeFillShade="D9"/>
             <w:vAlign w:val="center"/>
           </w:tcPr>
-          <w:p>
+          <w:p ns2:paraId="7B71C581" ns2:textId="77777777">
             <w:pPr>
               <w:rPr>
                 <w:b/>
@@ -3186,7 +3155,7 @@
             <w:shd w:val="clear" w:color="auto" w:fill="D9D9D9" w:themeFill="background1" w:themeFillShade="D9"/>
             <w:vAlign w:val="center"/>
           </w:tcPr>
-          <w:p>
+          <w:p ns2:paraId="56B2DC53" ns2:textId="77777777">
             <w:pPr>
               <w:rPr>
                 <w:b/>
@@ -3201,12 +3170,12 @@
           </w:p>
         </w:tc>
       </w:tr>
-      <w:tr>
+      <w:tr ns2:paraId="5A5F3F58" ns2:textId="77777777">
         <w:tc>
           <w:tcPr>
             <w:tcW w:w="1705" w:type="dxa"/>
           </w:tcPr>
-          <w:p>
+          <w:p ns2:paraId="1DA589EC" ns2:textId="77777777">
             <w:r>
               <w:t>{%tr for m in milestones %}</w:t>
             </w:r>
@@ -3216,21 +3185,21 @@
           <w:tcPr>
             <w:tcW w:w="2160" w:type="dxa"/>
           </w:tcPr>
-          <w:p/>
+          <w:p ns2:paraId="72A8ED83" ns2:textId="77777777"/>
         </w:tc>
         <w:tc>
           <w:tcPr>
             <w:tcW w:w="6925" w:type="dxa"/>
           </w:tcPr>
-          <w:p/>
+          <w:p ns2:paraId="55AC9F11" ns2:textId="77777777"/>
         </w:tc>
       </w:tr>
-      <w:tr>
+      <w:tr ns2:paraId="6B401AEC" ns2:textId="77777777">
         <w:tc>
           <w:tcPr>
             <w:tcW w:w="1705" w:type="dxa"/>
           </w:tcPr>
-          <w:p>
+          <w:p ns2:paraId="130DE997" ns2:textId="77777777">
             <w:r>
               <w:t>{{ m.phase }}</w:t>
             </w:r>
@@ -3240,7 +3209,7 @@
           <w:tcPr>
             <w:tcW w:w="2160" w:type="dxa"/>
           </w:tcPr>
-          <w:p>
+          <w:p ns2:paraId="17C6F86F" ns2:textId="77777777">
             <w:r>
               <w:t>{{ m.completion_date }}</w:t>
             </w:r>
@@ -3250,19 +3219,19 @@
           <w:tcPr>
             <w:tcW w:w="6925" w:type="dxa"/>
           </w:tcPr>
-          <w:p>
+          <w:p ns2:paraId="4735851A" ns2:textId="77777777">
             <w:r>
               <w:t>{{ m.deliverables }}</w:t>
             </w:r>
           </w:p>
         </w:tc>
       </w:tr>
-      <w:tr>
+      <w:tr ns2:paraId="29066FB2" ns2:textId="77777777">
         <w:tc>
           <w:tcPr>
             <w:tcW w:w="1705" w:type="dxa"/>
           </w:tcPr>
-          <w:p>
+          <w:p ns2:paraId="1555BFD4" ns2:textId="77777777">
             <w:r>
               <w:t>{%tr endfor %}</w:t>
             </w:r>
@@ -3272,24 +3241,24 @@
           <w:tcPr>
             <w:tcW w:w="2160" w:type="dxa"/>
           </w:tcPr>
-          <w:p/>
+          <w:p ns2:paraId="15ACF7AB" ns2:textId="77777777"/>
         </w:tc>
         <w:tc>
           <w:tcPr>
             <w:tcW w:w="6925" w:type="dxa"/>
           </w:tcPr>
-          <w:p/>
+          <w:p ns2:paraId="27A611D2" ns2:textId="77777777"/>
         </w:tc>
       </w:tr>
     </w:tbl>
-    <w:p>
+    <w:p ns2:paraId="1F7EDAAB" ns2:textId="77777777">
       <w:pPr>
         <w:rPr>
           <w:color w:val="808080" w:themeColor="background1" w:themeShade="80"/>
         </w:rPr>
       </w:pPr>
     </w:p>
-    <w:p>
+    <w:p ns2:paraId="609787B1" ns2:textId="77777777">
       <w:pPr>
         <w:pStyle w:val="Heading2"/>
       </w:pPr>
@@ -3299,12 +3268,12 @@
       </w:r>
       <w:bookmarkEnd w:id="8"/>
     </w:p>
-    <w:p>
+    <w:p ns2:paraId="6EEBEDA6" ns2:textId="77777777">
       <w:r>
         <w:t>{%p if aws_calculator_url %}</w:t>
       </w:r>
     </w:p>
-    <w:p>
+    <w:p ns2:paraId="76F7C14C" ns2:textId="77777777">
       <w:r>
         <w:rPr>
           <w:rStyle w:val="Strong"/>
@@ -3315,17 +3284,17 @@
         <w:t>{{ aws_calculator_url }}</w:t>
       </w:r>
     </w:p>
-    <w:p>
+    <w:p ns2:paraId="19BF854F" ns2:textId="77777777">
       <w:r>
         <w:t>{%p endif %}</w:t>
       </w:r>
     </w:p>
-    <w:p>
+    <w:p ns2:paraId="6369F58C" ns2:textId="77777777">
       <w:r>
         <w:t>{%p if aws_mrr %}</w:t>
       </w:r>
     </w:p>
-    <w:p>
+    <w:p ns2:paraId="72FDF17E" ns2:textId="77777777">
       <w:r>
         <w:rPr>
           <w:rStyle w:val="Strong"/>
@@ -3336,17 +3305,17 @@
         <w:t>{{ aws_mrr }}</w:t>
       </w:r>
     </w:p>
-    <w:p>
+    <w:p ns2:paraId="132675B9" ns2:textId="77777777">
       <w:r>
         <w:t>{%p endif %}</w:t>
       </w:r>
     </w:p>
-    <w:p>
+    <w:p ns2:paraId="457EF2EE" ns2:textId="77777777">
       <w:r>
         <w:t>{%p if aws_arr %}</w:t>
       </w:r>
     </w:p>
-    <w:p>
+    <w:p ns2:paraId="323A5B32" ns2:textId="77777777">
       <w:r>
         <w:rPr>
           <w:rStyle w:val="Strong"/>
@@ -3357,12 +3326,12 @@
         <w:t>{{ aws_arr }}</w:t>
       </w:r>
     </w:p>
-    <w:p>
+    <w:p ns2:paraId="03C952A0" ns2:textId="77777777">
       <w:r>
         <w:t>{%p endif %}</w:t>
       </w:r>
     </w:p>
-    <w:p>
+    <w:p ns2:paraId="5D738636" ns2:textId="77777777">
       <w:r>
         <w:t>{%p if aws_cost_breakdown_table %}</w:t>
       </w:r>
@@ -3379,13 +3348,13 @@
         <w:gridCol w:w="2161"/>
         <w:gridCol w:w="3736"/>
       </w:tblGrid>
-      <w:tr>
+      <w:tr ns2:paraId="37A7BD55" ns2:textId="77777777">
         <w:tc>
           <w:tcPr>
             <w:tcW w:w="2200" w:type="dxa"/>
             <w:shd w:val="clear" w:color="auto" w:fill="E7E6E6" w:themeFill="background2"/>
           </w:tcPr>
-          <w:p>
+          <w:p ns2:paraId="33F0A766" ns2:textId="77777777">
             <w:r>
               <w:rPr>
                 <w:rStyle w:val="Strong"/>
@@ -3399,7 +3368,7 @@
             <w:tcW w:w="2200" w:type="dxa"/>
             <w:shd w:val="clear" w:color="auto" w:fill="E7E6E6" w:themeFill="background2"/>
           </w:tcPr>
-          <w:p>
+          <w:p ns2:paraId="3252CF78" ns2:textId="77777777">
             <w:r>
               <w:rPr>
                 <w:rStyle w:val="Strong"/>
@@ -3413,7 +3382,7 @@
             <w:tcW w:w="2200" w:type="dxa"/>
             <w:shd w:val="clear" w:color="auto" w:fill="E7E6E6" w:themeFill="background2"/>
           </w:tcPr>
-          <w:p>
+          <w:p ns2:paraId="2DEDF926" ns2:textId="77777777">
             <w:r>
               <w:rPr>
                 <w:rStyle w:val="Strong"/>
@@ -3427,7 +3396,7 @@
             <w:tcW w:w="3835" w:type="dxa"/>
             <w:shd w:val="clear" w:color="auto" w:fill="E7E6E6" w:themeFill="background2"/>
           </w:tcPr>
-          <w:p>
+          <w:p ns2:paraId="1D7BF662" ns2:textId="77777777">
             <w:r>
               <w:rPr>
                 <w:rStyle w:val="Strong"/>
@@ -3437,12 +3406,12 @@
           </w:p>
         </w:tc>
       </w:tr>
-      <w:tr>
+      <w:tr ns2:paraId="41135333" ns2:textId="77777777">
         <w:tc>
           <w:tcPr>
             <w:tcW w:w="2200" w:type="dxa"/>
           </w:tcPr>
-          <w:p>
+          <w:p ns2:paraId="39173468" ns2:textId="77777777">
             <w:r>
               <w:t>{%tr for row in aws_cost_breakdown_table %}</w:t>
             </w:r>
@@ -3452,27 +3421,27 @@
           <w:tcPr>
             <w:tcW w:w="2200" w:type="dxa"/>
           </w:tcPr>
-          <w:p/>
+          <w:p ns2:paraId="4A423B0B" ns2:textId="77777777"/>
         </w:tc>
         <w:tc>
           <w:tcPr>
             <w:tcW w:w="2200" w:type="dxa"/>
           </w:tcPr>
-          <w:p/>
+          <w:p ns2:paraId="69DFF6DA" ns2:textId="77777777"/>
         </w:tc>
         <w:tc>
           <w:tcPr>
             <w:tcW w:w="3835" w:type="dxa"/>
           </w:tcPr>
-          <w:p/>
+          <w:p ns2:paraId="500DEB93" ns2:textId="77777777"/>
         </w:tc>
       </w:tr>
-      <w:tr>
+      <w:tr ns2:paraId="349015BC" ns2:textId="77777777">
         <w:tc>
           <w:tcPr>
             <w:tcW w:w="2200" w:type="dxa"/>
           </w:tcPr>
-          <w:p>
+          <w:p ns2:paraId="1D6B9B7A" ns2:textId="77777777">
             <w:r>
               <w:t>{{ row.category }}</w:t>
             </w:r>
@@ -3482,7 +3451,7 @@
           <w:tcPr>
             <w:tcW w:w="2200" w:type="dxa"/>
           </w:tcPr>
-          <w:p>
+          <w:p ns2:paraId="443869E4" ns2:textId="77777777">
             <w:r>
               <w:t>{{ row.mrr }}</w:t>
             </w:r>
@@ -3492,7 +3461,7 @@
           <w:tcPr>
             <w:tcW w:w="2200" w:type="dxa"/>
           </w:tcPr>
-          <w:p>
+          <w:p ns2:paraId="4343301C" ns2:textId="77777777">
             <w:r>
               <w:t>{{ row.arr }}</w:t>
             </w:r>
@@ -3502,19 +3471,19 @@
           <w:tcPr>
             <w:tcW w:w="3835" w:type="dxa"/>
           </w:tcPr>
-          <w:p>
+          <w:p ns2:paraId="03998BAD" ns2:textId="77777777">
             <w:r>
               <w:t>{{ row.note }}</w:t>
             </w:r>
           </w:p>
         </w:tc>
       </w:tr>
-      <w:tr>
+      <w:tr ns2:paraId="081274D3" ns2:textId="77777777">
         <w:tc>
           <w:tcPr>
             <w:tcW w:w="2200" w:type="dxa"/>
           </w:tcPr>
-          <w:p>
+          <w:p ns2:paraId="169E9561" ns2:textId="77777777">
             <w:r>
               <w:t>{%tr endfor %}</w:t>
             </w:r>
@@ -3524,33 +3493,33 @@
           <w:tcPr>
             <w:tcW w:w="2200" w:type="dxa"/>
           </w:tcPr>
-          <w:p/>
+          <w:p ns2:paraId="5CD57A09" ns2:textId="77777777"/>
         </w:tc>
         <w:tc>
           <w:tcPr>
             <w:tcW w:w="2200" w:type="dxa"/>
           </w:tcPr>
-          <w:p/>
+          <w:p ns2:paraId="04B79645" ns2:textId="77777777"/>
         </w:tc>
         <w:tc>
           <w:tcPr>
             <w:tcW w:w="3835" w:type="dxa"/>
           </w:tcPr>
-          <w:p/>
+          <w:p ns2:paraId="120C973B" ns2:textId="77777777"/>
         </w:tc>
       </w:tr>
     </w:tbl>
-    <w:p>
+    <w:p ns2:paraId="47187395" ns2:textId="77777777">
       <w:r>
         <w:t>{%p endif %}</w:t>
       </w:r>
     </w:p>
-    <w:p>
+    <w:p ns2:paraId="1016E60F" ns2:textId="77777777">
       <w:r>
         <w:t>{%p if aws_bedrock_extra %}</w:t>
       </w:r>
     </w:p>
-    <w:p>
+    <w:p ns2:paraId="59849980" ns2:textId="77777777">
       <w:pPr>
         <w:rPr>
           <w:rStyle w:val="Strong"/>
@@ -3563,22 +3532,22 @@
         <w:t>Bedrock (Extra)</w:t>
       </w:r>
     </w:p>
-    <w:p>
+    <w:p ns2:paraId="4F01AB5A" ns2:textId="77777777">
       <w:r>
         <w:t>{{ aws_bedrock_extra }}</w:t>
       </w:r>
     </w:p>
-    <w:p>
+    <w:p ns2:paraId="0E176C19" ns2:textId="77777777">
       <w:r>
         <w:t>{%p endif %}</w:t>
       </w:r>
     </w:p>
-    <w:p>
+    <w:p ns2:paraId="339AAABD" ns2:textId="77777777">
       <w:r>
         <w:t>{%p if aws_monthly_cost_summary and not aws_mrr %}</w:t>
       </w:r>
     </w:p>
-    <w:p>
+    <w:p ns2:paraId="4F94DC37" ns2:textId="77777777">
       <w:pPr>
         <w:rPr>
           <w:iCs/>
@@ -3599,17 +3568,17 @@
         <w:t>_monthly_cost_summary }}</w:t>
       </w:r>
     </w:p>
-    <w:p>
+    <w:p ns2:paraId="1CD115BB" ns2:textId="77777777">
       <w:r>
         <w:t>{%p endif %}</w:t>
       </w:r>
     </w:p>
-    <w:p>
+    <w:p ns2:paraId="3EF62544" ns2:textId="000E5FBF">
       <w:r>
         <w:br w:type="page"/>
       </w:r>
     </w:p>
-    <w:p>
+    <w:p ns2:paraId="4101D68F" ns2:textId="77777777">
       <w:pPr>
         <w:pStyle w:val="Heading1"/>
       </w:pPr>
@@ -3622,12 +3591,12 @@
       <w:bookmarkEnd w:id="9"/>
       <w:bookmarkEnd w:id="10"/>
     </w:p>
-    <w:p>
+    <w:p ns2:paraId="7E90FAB2" ns2:textId="77777777">
       <w:r>
         <w:t>{%p if acceptance_steps %}</w:t>
       </w:r>
     </w:p>
-    <w:p>
+    <w:p ns2:paraId="1C3B620E" ns2:textId="77777777">
       <w:pPr>
         <w:pStyle w:val="Heading2"/>
       </w:pPr>
@@ -3635,17 +3604,17 @@
         <w:t>Acceptance Process</w:t>
       </w:r>
     </w:p>
-    <w:p>
+    <w:p ns2:paraId="2D2D72A0" ns2:textId="77777777">
       <w:r>
         <w:t>{%p endif %}</w:t>
       </w:r>
     </w:p>
-    <w:p>
+    <w:p ns2:paraId="43933F2A" ns2:textId="77777777">
       <w:r>
         <w:t>{%p for step in acceptance_steps %}</w:t>
       </w:r>
     </w:p>
-    <w:p>
+    <w:p ns2:paraId="02EAFC56" ns2:textId="77777777">
       <w:pPr>
         <w:pStyle w:val="Heading3"/>
         <w:numPr>
@@ -3657,17 +3626,17 @@
         <w:t>({{ loop.index }}) {{ step.heading }}</w:t>
       </w:r>
     </w:p>
-    <w:p>
+    <w:p ns2:paraId="0BDF2D10" ns2:textId="77777777">
       <w:r>
         <w:t>{{ step.content }}</w:t>
       </w:r>
     </w:p>
-    <w:p>
+    <w:p ns2:paraId="0BD06CAD" ns2:textId="77777777">
       <w:r>
         <w:t>{%p for item in step.bullets %}</w:t>
       </w:r>
     </w:p>
-    <w:p>
+    <w:p ns2:paraId="55E5D33F" ns2:textId="77777777">
       <w:pPr>
         <w:pStyle w:val="ListParagraph"/>
         <w:numPr>
@@ -3679,22 +3648,22 @@
         <w:t>{{ item }}</w:t>
       </w:r>
     </w:p>
-    <w:p>
+    <w:p ns2:paraId="6CE6017D" ns2:textId="77777777">
       <w:r>
         <w:t>{%p endfor %}</w:t>
       </w:r>
     </w:p>
-    <w:p>
+    <w:p ns2:paraId="4ED3F70B" ns2:textId="77777777">
       <w:r>
         <w:t>{%p endfor %}</w:t>
       </w:r>
     </w:p>
-    <w:p>
+    <w:p ns2:paraId="34B94AB9" ns2:textId="77777777">
       <w:r>
         <w:t>{%p if not acceptance_steps and acceptance_text %}</w:t>
       </w:r>
     </w:p>
-    <w:p>
+    <w:p ns2:paraId="437459FF" ns2:textId="77777777">
       <w:pPr>
         <w:rPr>
           <w:iCs/>
@@ -3715,17 +3684,17 @@
         <w:t>_text }}</w:t>
       </w:r>
     </w:p>
-    <w:p>
+    <w:p ns2:paraId="61AD6DB7" ns2:textId="77777777">
       <w:r>
         <w:t>{%p endif %}</w:t>
       </w:r>
     </w:p>
-    <w:p>
+    <w:p ns2:paraId="4B5A5A7A" ns2:textId="77777777">
       <w:r>
         <w:br w:type="page"/>
       </w:r>
     </w:p>
-    <w:p>
+    <w:p ns2:paraId="04007DF2" ns2:textId="77777777">
       <w:pPr>
         <w:pStyle w:val="Heading1"/>
       </w:pPr>
@@ -3736,7 +3705,7 @@
       </w:r>
       <w:bookmarkEnd w:id="11"/>
     </w:p>
-    <w:p>
+    <w:p ns2:paraId="5556FCC4" ns2:textId="77777777">
       <w:pPr>
         <w:rPr>
           <w:rStyle w:val="Strong"/>
@@ -3749,12 +3718,12 @@
         <w:t>Partner Technical Team</w:t>
       </w:r>
     </w:p>
-    <w:p>
+    <w:p ns2:paraId="052BCBA4" ns2:textId="77777777">
       <w:r>
         <w:t>{%p for member in partner_technical_team %}</w:t>
       </w:r>
     </w:p>
-    <w:p>
+    <w:p ns2:paraId="7C2FFD49" ns2:textId="77777777">
       <w:pPr>
         <w:pStyle w:val="ListParagraph"/>
         <w:numPr>
@@ -3772,12 +3741,12 @@
         <w:t>{{ member.name }}</w:t>
       </w:r>
     </w:p>
-    <w:p>
+    <w:p ns2:paraId="5814C7E3" ns2:textId="77777777">
       <w:r>
         <w:t>{%p endfor %}</w:t>
       </w:r>
     </w:p>
-    <w:p/>
+    <w:p ns2:paraId="30453EBC" ns2:textId="77777777"/>
     <w:tbl>
       <w:tblPr>
         <w:tblStyle w:val="TableGrid"/>
@@ -3788,13 +3757,13 @@
         <w:gridCol w:w="2245"/>
         <w:gridCol w:w="2692"/>
       </w:tblGrid>
-      <w:tr>
+      <w:tr ns2:paraId="6F385D90" ns2:textId="77777777">
         <w:tc>
           <w:tcPr>
             <w:tcW w:w="2245" w:type="dxa"/>
             <w:shd w:val="clear" w:color="auto" w:fill="D9D9D9" w:themeFill="background1" w:themeFillShade="D9"/>
           </w:tcPr>
-          <w:p>
+          <w:p ns2:paraId="3CCADCB0" ns2:textId="77777777">
             <w:pPr>
               <w:rPr>
                 <w:b/>
@@ -3813,7 +3782,7 @@
             <w:tcW w:w="2026" w:type="dxa"/>
             <w:shd w:val="clear" w:color="auto" w:fill="D9D9D9" w:themeFill="background1" w:themeFillShade="D9"/>
           </w:tcPr>
-          <w:p>
+          <w:p ns2:paraId="4D812A16" ns2:textId="77777777">
             <w:pPr>
               <w:rPr>
                 <w:b/>
@@ -3828,14 +3797,14 @@
           </w:p>
         </w:tc>
       </w:tr>
-      <w:tr>
+      <w:tr ns2:paraId="60209EDA" ns2:textId="77777777">
         <w:tc>
           <w:tcPr>
             <w:tcW w:w="2245" w:type="dxa"/>
           </w:tcPr>
-          <w:p>
-            <w:r>
-              <w:t>Solution Architects</w:t>
+          <w:p ns2:paraId="606A59C4" ns2:textId="77777777">
+            <w:r>
+              <w:t>{%tr for role in role_rates %}</w:t>
             </w:r>
           </w:p>
         </w:tc>
@@ -3843,21 +3812,21 @@
           <w:tcPr>
             <w:tcW w:w="2026" w:type="dxa"/>
           </w:tcPr>
-          <w:p>
-            <w:r>
-              <w:t>{{ rate_solution_architect }}</w:t>
+          <w:p ns2:paraId="6B02A92A" ns2:textId="77777777">
+            <w:r>
+              <w:t/>
             </w:r>
           </w:p>
         </w:tc>
       </w:tr>
-      <w:tr>
+      <w:tr ns2:paraId="32E13E41" ns2:textId="77777777">
         <w:tc>
           <w:tcPr>
             <w:tcW w:w="2245" w:type="dxa"/>
           </w:tcPr>
-          <w:p>
-            <w:r>
-              <w:t>Engineers</w:t>
+          <w:p ns2:paraId="5E7AEEEE" ns2:textId="77777777">
+            <w:r>
+              <w:t>{{ role.role }} ({{ role.count }})</w:t>
             </w:r>
           </w:p>
         </w:tc>
@@ -3865,27 +3834,27 @@
           <w:tcPr>
             <w:tcW w:w="2026" w:type="dxa"/>
           </w:tcPr>
-          <w:p>
-            <w:r>
-              <w:t>{{ rate_engineer }}</w:t>
+          <w:p ns2:paraId="2D2D0338" ns2:textId="77777777">
+            <w:r>
+              <w:t>{{ role.rate }}</w:t>
             </w:r>
           </w:p>
         </w:tc>
       </w:tr>
-      <w:tr>
+      <w:tr ns2:paraId="57A5BF78" ns2:textId="77777777">
         <w:tc>
           <w:tcPr>
             <w:tcW w:w="2245" w:type="dxa"/>
           </w:tcPr>
-          <w:p>
-            <w:r>
-              <w:t xml:space="preserve">Other </w:t>
+          <w:p ns2:paraId="061E2553" ns2:textId="77777777">
+            <w:r>
+              <w:t xml:space="preserve">{%tr endfor %}</w:t>
             </w:r>
             <w:r>
               <w:rPr>
                 <w:sz w:val="18"/>
               </w:rPr>
-              <w:t>(Please specify)</w:t>
+              <w:t/>
             </w:r>
           </w:p>
         </w:tc>
@@ -3893,461 +3862,17 @@
           <w:tcPr>
             <w:tcW w:w="2026" w:type="dxa"/>
           </w:tcPr>
-          <w:p>
-            <w:r>
-              <w:t>{{ rate_other }}</w:t>
+          <w:p ns2:paraId="4D8A8F3C" ns2:textId="77777777">
+            <w:r>
+              <w:t/>
             </w:r>
           </w:p>
         </w:tc>
       </w:tr>
     </w:tbl>
-    <w:p/>
-    <w:tbl>
-      <w:tblPr>
-        <w:tblStyle w:val="TableGrid"/>
-        <w:tblW w:w="0" w:type="auto"/>
-        <w:tblLook w:val="04A0" w:firstRow="1" w:lastRow="0" w:firstColumn="1" w:lastColumn="0" w:noHBand="0" w:noVBand="1"/>
-      </w:tblPr>
-      <w:tblGrid>
-        <w:gridCol w:w="1943"/>
-        <w:gridCol w:w="1878"/>
-        <w:gridCol w:w="2016"/>
-        <w:gridCol w:w="2178"/>
-        <w:gridCol w:w="2106"/>
-      </w:tblGrid>
-      <w:tr>
-        <w:tc>
-          <w:tcPr>
-            <w:tcW w:w="1943" w:type="dxa"/>
-            <w:shd w:val="clear" w:color="auto" w:fill="D9D9D9" w:themeFill="background1" w:themeFillShade="D9"/>
-            <w:vAlign w:val="center"/>
-          </w:tcPr>
-          <w:p>
-            <w:pPr>
-              <w:jc w:val="center"/>
-              <w:rPr>
-                <w:b/>
-              </w:rPr>
-            </w:pPr>
-            <w:r>
-              <w:rPr>
-                <w:b/>
-              </w:rPr>
-              <w:t>Project Phase</w:t>
-            </w:r>
-          </w:p>
-        </w:tc>
-        <w:tc>
-          <w:tcPr>
-            <w:tcW w:w="1721" w:type="dxa"/>
-            <w:shd w:val="clear" w:color="auto" w:fill="D9D9D9" w:themeFill="background1" w:themeFillShade="D9"/>
-            <w:vAlign w:val="center"/>
-          </w:tcPr>
-          <w:p>
-            <w:pPr>
-              <w:jc w:val="center"/>
-              <w:rPr>
-                <w:b/>
-              </w:rPr>
-            </w:pPr>
-            <w:r>
-              <w:rPr>
-                <w:b/>
-              </w:rPr>
-              <w:t>Solution Architects</w:t>
-            </w:r>
-          </w:p>
-        </w:tc>
-        <w:tc>
-          <w:tcPr>
-            <w:tcW w:w="1804" w:type="dxa"/>
-            <w:shd w:val="clear" w:color="auto" w:fill="D9D9D9" w:themeFill="background1" w:themeFillShade="D9"/>
-            <w:vAlign w:val="center"/>
-          </w:tcPr>
-          <w:p>
-            <w:pPr>
-              <w:jc w:val="center"/>
-              <w:rPr>
-                <w:b/>
-              </w:rPr>
-            </w:pPr>
-            <w:r>
-              <w:rPr>
-                <w:b/>
-              </w:rPr>
-              <w:t>Engineers</w:t>
-            </w:r>
-          </w:p>
-        </w:tc>
-        <w:tc>
-          <w:tcPr>
-            <w:tcW w:w="1831" w:type="dxa"/>
-            <w:shd w:val="clear" w:color="auto" w:fill="D9D9D9" w:themeFill="background1" w:themeFillShade="D9"/>
-            <w:vAlign w:val="center"/>
-          </w:tcPr>
-          <w:p>
-            <w:pPr>
-              <w:jc w:val="center"/>
-              <w:rPr>
-                <w:b/>
-              </w:rPr>
-            </w:pPr>
-            <w:r>
-              <w:rPr>
-                <w:b/>
-              </w:rPr>
-              <w:t xml:space="preserve">Other </w:t>
-            </w:r>
-          </w:p>
-          <w:p>
-            <w:pPr>
-              <w:jc w:val="center"/>
-              <w:rPr>
-                <w:b/>
-              </w:rPr>
-            </w:pPr>
-            <w:r>
-              <w:rPr>
-                <w:b/>
-                <w:sz w:val="18"/>
-              </w:rPr>
-              <w:t>(Please specify)</w:t>
-            </w:r>
-          </w:p>
-        </w:tc>
-        <w:tc>
-          <w:tcPr>
-            <w:tcW w:w="1641" w:type="dxa"/>
-            <w:shd w:val="clear" w:color="auto" w:fill="D9D9D9" w:themeFill="background1" w:themeFillShade="D9"/>
-            <w:vAlign w:val="center"/>
-          </w:tcPr>
-          <w:p>
-            <w:pPr>
-              <w:jc w:val="center"/>
-              <w:rPr>
-                <w:b/>
-              </w:rPr>
-            </w:pPr>
-            <w:r>
-              <w:rPr>
-                <w:b/>
-              </w:rPr>
-              <w:t>Total Hours</w:t>
-            </w:r>
-          </w:p>
-        </w:tc>
-      </w:tr>
-      <w:tr>
-        <w:tc>
-          <w:tcPr>
-            <w:tcW w:w="1943" w:type="dxa"/>
-            <w:vAlign w:val="center"/>
-          </w:tcPr>
-          <w:p>
-            <w:pPr>
-              <w:jc w:val="center"/>
-            </w:pPr>
-            <w:r>
-              <w:t>{%tr for ph in phase_hours_table %}</w:t>
-            </w:r>
-          </w:p>
-        </w:tc>
-        <w:tc>
-          <w:tcPr>
-            <w:tcW w:w="1721" w:type="dxa"/>
-          </w:tcPr>
-          <w:p/>
-        </w:tc>
-        <w:tc>
-          <w:tcPr>
-            <w:tcW w:w="1804" w:type="dxa"/>
-          </w:tcPr>
-          <w:p/>
-        </w:tc>
-        <w:tc>
-          <w:tcPr>
-            <w:tcW w:w="1831" w:type="dxa"/>
-          </w:tcPr>
-          <w:p/>
-        </w:tc>
-        <w:tc>
-          <w:tcPr>
-            <w:tcW w:w="1641" w:type="dxa"/>
-          </w:tcPr>
-          <w:p/>
-        </w:tc>
-      </w:tr>
-      <w:tr>
-        <w:tc>
-          <w:tcPr>
-            <w:tcW w:w="1943" w:type="dxa"/>
-            <w:vAlign w:val="center"/>
-          </w:tcPr>
-          <w:p>
-            <w:pPr>
-              <w:jc w:val="center"/>
-            </w:pPr>
-            <w:r>
-              <w:t>{{ ph.phase }}</w:t>
-            </w:r>
-          </w:p>
-        </w:tc>
-        <w:tc>
-          <w:tcPr>
-            <w:tcW w:w="1721" w:type="dxa"/>
-          </w:tcPr>
-          <w:p>
-            <w:r>
-              <w:t>{{ ph.sa_hours }}</w:t>
-            </w:r>
-          </w:p>
-        </w:tc>
-        <w:tc>
-          <w:tcPr>
-            <w:tcW w:w="1804" w:type="dxa"/>
-          </w:tcPr>
-          <w:p>
-            <w:r>
-              <w:t>{{ ph.eng_hours }}</w:t>
-            </w:r>
-          </w:p>
-        </w:tc>
-        <w:tc>
-          <w:tcPr>
-            <w:tcW w:w="1831" w:type="dxa"/>
-          </w:tcPr>
-          <w:p>
-            <w:r>
-              <w:t>{{ ph.other_hours }}</w:t>
-            </w:r>
-          </w:p>
-        </w:tc>
-        <w:tc>
-          <w:tcPr>
-            <w:tcW w:w="1641" w:type="dxa"/>
-          </w:tcPr>
-          <w:p>
-            <w:r>
-              <w:t>{{ ph.total }}</w:t>
-            </w:r>
-          </w:p>
-        </w:tc>
-      </w:tr>
-      <w:tr>
-        <w:tc>
-          <w:tcPr>
-            <w:tcW w:w="1943" w:type="dxa"/>
-            <w:vAlign w:val="center"/>
-          </w:tcPr>
-          <w:p>
-            <w:pPr>
-              <w:jc w:val="center"/>
-            </w:pPr>
-            <w:r>
-              <w:t>{%tr endfor %}</w:t>
-            </w:r>
-          </w:p>
-        </w:tc>
-        <w:tc>
-          <w:tcPr>
-            <w:tcW w:w="1721" w:type="dxa"/>
-          </w:tcPr>
-          <w:p/>
-        </w:tc>
-        <w:tc>
-          <w:tcPr>
-            <w:tcW w:w="1804" w:type="dxa"/>
-          </w:tcPr>
-          <w:p/>
-        </w:tc>
-        <w:tc>
-          <w:tcPr>
-            <w:tcW w:w="1831" w:type="dxa"/>
-          </w:tcPr>
-          <w:p/>
-        </w:tc>
-        <w:tc>
-          <w:tcPr>
-            <w:tcW w:w="1641" w:type="dxa"/>
-          </w:tcPr>
-          <w:p/>
-        </w:tc>
-      </w:tr>
-      <w:tr>
-        <w:tc>
-          <w:tcPr>
-            <w:tcW w:w="1943" w:type="dxa"/>
-            <w:tcBorders>
-              <w:top w:val="double" w:sz="4" w:space="0" w:color="auto"/>
-              <w:left w:val="single" w:sz="12" w:space="0" w:color="auto"/>
-              <w:bottom w:val="single" w:sz="2" w:space="0" w:color="auto"/>
-              <w:right w:val="single" w:sz="2" w:space="0" w:color="auto"/>
-            </w:tcBorders>
-            <w:vAlign w:val="center"/>
-          </w:tcPr>
-          <w:p>
-            <w:pPr>
-              <w:jc w:val="center"/>
-            </w:pPr>
-            <w:r>
-              <w:t>Total Hours</w:t>
-            </w:r>
-          </w:p>
-        </w:tc>
-        <w:tc>
-          <w:tcPr>
-            <w:tcW w:w="1721" w:type="dxa"/>
-            <w:tcBorders>
-              <w:top w:val="double" w:sz="4" w:space="0" w:color="auto"/>
-              <w:left w:val="single" w:sz="2" w:space="0" w:color="auto"/>
-              <w:bottom w:val="single" w:sz="2" w:space="0" w:color="auto"/>
-              <w:right w:val="single" w:sz="2" w:space="0" w:color="auto"/>
-            </w:tcBorders>
-          </w:tcPr>
-          <w:p>
-            <w:r>
-              <w:t>{{ total_hours.sa }}</w:t>
-            </w:r>
-          </w:p>
-        </w:tc>
-        <w:tc>
-          <w:tcPr>
-            <w:tcW w:w="1804" w:type="dxa"/>
-            <w:tcBorders>
-              <w:top w:val="double" w:sz="4" w:space="0" w:color="auto"/>
-              <w:left w:val="single" w:sz="2" w:space="0" w:color="auto"/>
-              <w:bottom w:val="single" w:sz="2" w:space="0" w:color="auto"/>
-              <w:right w:val="single" w:sz="2" w:space="0" w:color="auto"/>
-            </w:tcBorders>
-          </w:tcPr>
-          <w:p>
-            <w:r>
-              <w:t>{{ total_hours.eng }}</w:t>
-            </w:r>
-          </w:p>
-        </w:tc>
-        <w:tc>
-          <w:tcPr>
-            <w:tcW w:w="1831" w:type="dxa"/>
-            <w:tcBorders>
-              <w:top w:val="double" w:sz="4" w:space="0" w:color="auto"/>
-              <w:left w:val="single" w:sz="2" w:space="0" w:color="auto"/>
-              <w:bottom w:val="single" w:sz="2" w:space="0" w:color="auto"/>
-              <w:right w:val="single" w:sz="2" w:space="0" w:color="auto"/>
-            </w:tcBorders>
-          </w:tcPr>
-          <w:p>
-            <w:r>
-              <w:t>{{ total_hours.other }}</w:t>
-            </w:r>
-          </w:p>
-        </w:tc>
-        <w:tc>
-          <w:tcPr>
-            <w:tcW w:w="1641" w:type="dxa"/>
-            <w:tcBorders>
-              <w:top w:val="double" w:sz="4" w:space="0" w:color="auto"/>
-              <w:left w:val="single" w:sz="2" w:space="0" w:color="auto"/>
-              <w:bottom w:val="single" w:sz="2" w:space="0" w:color="auto"/>
-              <w:right w:val="single" w:sz="12" w:space="0" w:color="auto"/>
-            </w:tcBorders>
-          </w:tcPr>
-          <w:p>
-            <w:r>
-              <w:t>{{ total_hours.total }}</w:t>
-            </w:r>
-          </w:p>
-        </w:tc>
-      </w:tr>
-      <w:tr>
-        <w:tc>
-          <w:tcPr>
-            <w:tcW w:w="1943" w:type="dxa"/>
-            <w:tcBorders>
-              <w:top w:val="single" w:sz="2" w:space="0" w:color="auto"/>
-              <w:left w:val="single" w:sz="12" w:space="0" w:color="auto"/>
-              <w:bottom w:val="single" w:sz="12" w:space="0" w:color="auto"/>
-              <w:right w:val="single" w:sz="2" w:space="0" w:color="auto"/>
-            </w:tcBorders>
-            <w:vAlign w:val="center"/>
-          </w:tcPr>
-          <w:p>
-            <w:pPr>
-              <w:jc w:val="center"/>
-            </w:pPr>
-            <w:r>
-              <w:t>Total Cost</w:t>
-            </w:r>
-          </w:p>
-        </w:tc>
-        <w:tc>
-          <w:tcPr>
-            <w:tcW w:w="1721" w:type="dxa"/>
-            <w:tcBorders>
-              <w:top w:val="single" w:sz="2" w:space="0" w:color="auto"/>
-              <w:left w:val="single" w:sz="2" w:space="0" w:color="auto"/>
-              <w:bottom w:val="single" w:sz="12" w:space="0" w:color="auto"/>
-              <w:right w:val="single" w:sz="2" w:space="0" w:color="auto"/>
-            </w:tcBorders>
-          </w:tcPr>
-          <w:p>
-            <w:r>
-              <w:t>{{ total_cost.sa }}</w:t>
-            </w:r>
-          </w:p>
-        </w:tc>
-        <w:tc>
-          <w:tcPr>
-            <w:tcW w:w="1804" w:type="dxa"/>
-            <w:tcBorders>
-              <w:top w:val="single" w:sz="2" w:space="0" w:color="auto"/>
-              <w:left w:val="single" w:sz="2" w:space="0" w:color="auto"/>
-              <w:bottom w:val="single" w:sz="12" w:space="0" w:color="auto"/>
-              <w:right w:val="single" w:sz="2" w:space="0" w:color="auto"/>
-            </w:tcBorders>
-          </w:tcPr>
-          <w:p>
-            <w:r>
-              <w:t>{{ total_cost.eng }}</w:t>
-            </w:r>
-          </w:p>
-        </w:tc>
-        <w:tc>
-          <w:tcPr>
-            <w:tcW w:w="1831" w:type="dxa"/>
-            <w:tcBorders>
-              <w:top w:val="single" w:sz="2" w:space="0" w:color="auto"/>
-              <w:left w:val="single" w:sz="2" w:space="0" w:color="auto"/>
-              <w:bottom w:val="single" w:sz="12" w:space="0" w:color="auto"/>
-              <w:right w:val="single" w:sz="2" w:space="0" w:color="auto"/>
-            </w:tcBorders>
-          </w:tcPr>
-          <w:p>
-            <w:r>
-              <w:t>{{ total_cost.other }}</w:t>
-            </w:r>
-          </w:p>
-        </w:tc>
-        <w:tc>
-          <w:tcPr>
-            <w:tcW w:w="1641" w:type="dxa"/>
-            <w:tcBorders>
-              <w:top w:val="single" w:sz="2" w:space="0" w:color="auto"/>
-              <w:left w:val="single" w:sz="2" w:space="0" w:color="auto"/>
-              <w:bottom w:val="single" w:sz="12" w:space="0" w:color="auto"/>
-              <w:right w:val="single" w:sz="12" w:space="0" w:color="auto"/>
-            </w:tcBorders>
-          </w:tcPr>
-          <w:p>
-            <w:r>
-              <w:t>{{ total_cost.total }}</w:t>
-            </w:r>
-          </w:p>
-        </w:tc>
-      </w:tr>
-    </w:tbl>
-    <w:p/>
-    <w:p>
+    <w:p ns2:paraId="0CAF5429" ns2:textId="77777777"/>
+    <w:p ns2:paraId="773EF6CB" ns2:textId="77777777"/>
+    <w:p ns2:paraId="458EBBB6" ns2:textId="77777777">
       <w:r>
         <w:t>Cost Contribution distribution between Partner, Customer, AWS:</w:t>
       </w:r>
@@ -4363,13 +3888,13 @@
         <w:gridCol w:w="3364"/>
         <w:gridCol w:w="2945"/>
       </w:tblGrid>
-      <w:tr>
+      <w:tr ns2:paraId="74F46B40" ns2:textId="77777777">
         <w:tc>
           <w:tcPr>
             <w:tcW w:w="1975" w:type="dxa"/>
             <w:shd w:val="clear" w:color="auto" w:fill="D9D9D9" w:themeFill="background1" w:themeFillShade="D9"/>
           </w:tcPr>
-          <w:p>
+          <w:p ns2:paraId="0FC41999" ns2:textId="77777777">
             <w:pPr>
               <w:rPr>
                 <w:b/>
@@ -4388,7 +3913,7 @@
             <w:tcW w:w="2070" w:type="dxa"/>
             <w:shd w:val="clear" w:color="auto" w:fill="D9D9D9" w:themeFill="background1" w:themeFillShade="D9"/>
           </w:tcPr>
-          <w:p>
+          <w:p ns2:paraId="7116CC4F" ns2:textId="77777777">
             <w:pPr>
               <w:rPr>
                 <w:b/>
@@ -4407,7 +3932,7 @@
             <w:tcW w:w="2520" w:type="dxa"/>
             <w:shd w:val="clear" w:color="auto" w:fill="D9D9D9" w:themeFill="background1" w:themeFillShade="D9"/>
           </w:tcPr>
-          <w:p>
+          <w:p ns2:paraId="12A8E8B7" ns2:textId="77777777">
             <w:pPr>
               <w:rPr>
                 <w:b/>
@@ -4422,12 +3947,12 @@
           </w:p>
         </w:tc>
       </w:tr>
-      <w:tr>
+      <w:tr ns2:paraId="630298BC" ns2:textId="77777777">
         <w:tc>
           <w:tcPr>
             <w:tcW w:w="1975" w:type="dxa"/>
           </w:tcPr>
-          <w:p>
+          <w:p ns2:paraId="5FC36DFC" ns2:textId="77777777">
             <w:r>
               <w:t>Customer</w:t>
             </w:r>
@@ -4437,7 +3962,7 @@
           <w:tcPr>
             <w:tcW w:w="2070" w:type="dxa"/>
           </w:tcPr>
-          <w:p>
+          <w:p ns2:paraId="675F4093" ns2:textId="77777777">
             <w:r>
               <w:t>{{ contribution.customer.amount }}</w:t>
             </w:r>
@@ -4447,19 +3972,19 @@
           <w:tcPr>
             <w:tcW w:w="2520" w:type="dxa"/>
           </w:tcPr>
-          <w:p>
+          <w:p ns2:paraId="4C3D340C" ns2:textId="77777777">
             <w:r>
               <w:t>{{ contribution.customer.pct }}</w:t>
             </w:r>
           </w:p>
         </w:tc>
       </w:tr>
-      <w:tr>
+      <w:tr ns2:paraId="28C7BCCB" ns2:textId="77777777">
         <w:tc>
           <w:tcPr>
             <w:tcW w:w="1975" w:type="dxa"/>
           </w:tcPr>
-          <w:p>
+          <w:p ns2:paraId="75AA3F1B" ns2:textId="77777777">
             <w:r>
               <w:t>Partner</w:t>
             </w:r>
@@ -4469,7 +3994,7 @@
           <w:tcPr>
             <w:tcW w:w="2070" w:type="dxa"/>
           </w:tcPr>
-          <w:p>
+          <w:p ns2:paraId="1F43F4B5" ns2:textId="77777777">
             <w:r>
               <w:t>{{ contribution.partner.amount }}</w:t>
             </w:r>
@@ -4479,19 +4004,19 @@
           <w:tcPr>
             <w:tcW w:w="2520" w:type="dxa"/>
           </w:tcPr>
-          <w:p>
+          <w:p ns2:paraId="0D0F8E03" ns2:textId="77777777">
             <w:r>
               <w:t>{{ contribution.partner.pct }}</w:t>
             </w:r>
           </w:p>
         </w:tc>
       </w:tr>
-      <w:tr>
+      <w:tr ns2:paraId="4EC61E2F" ns2:textId="77777777">
         <w:tc>
           <w:tcPr>
             <w:tcW w:w="1975" w:type="dxa"/>
           </w:tcPr>
-          <w:p>
+          <w:p ns2:paraId="11A277F6" ns2:textId="77777777">
             <w:r>
               <w:t>AWS</w:t>
             </w:r>
@@ -4501,7 +4026,7 @@
           <w:tcPr>
             <w:tcW w:w="2070" w:type="dxa"/>
           </w:tcPr>
-          <w:p>
+          <w:p ns2:paraId="20E0E565" ns2:textId="77777777">
             <w:r>
               <w:t>{{ contribution.aws.amount }}</w:t>
             </w:r>
@@ -4511,7 +4036,7 @@
           <w:tcPr>
             <w:tcW w:w="2520" w:type="dxa"/>
           </w:tcPr>
-          <w:p>
+          <w:p ns2:paraId="6ECD230A" ns2:textId="77777777">
             <w:r>
               <w:t>{{ contribution.aws.pct }}</w:t>
             </w:r>
@@ -4519,8 +4044,8 @@
         </w:tc>
       </w:tr>
     </w:tbl>
-    <w:p/>
-    <w:p>
+    <w:p ns2:paraId="5A4BA8E1" ns2:textId="77777777"/>
+    <w:p ns2:paraId="3A495C49" ns2:textId="77777777">
       <w:pPr>
         <w:rPr>
           <w:rStyle w:val="Strong"/>
@@ -4533,7 +4058,7 @@
         <w:br w:type="page"/>
       </w:r>
     </w:p>
-    <w:p>
+    <w:p ns2:paraId="239AA44B" ns2:textId="72F4F434">
       <w:pPr>
         <w:rPr>
           <w:rStyle w:val="Strong"/>
@@ -4557,13 +4082,13 @@
         <w:gridCol w:w="3000"/>
         <w:gridCol w:w="7435"/>
       </w:tblGrid>
-      <w:tr>
+      <w:tr ns2:paraId="2CCAA87D" ns2:textId="77777777">
         <w:tc>
           <w:tcPr>
             <w:tcW w:w="3000" w:type="dxa"/>
             <w:shd w:val="clear" w:color="auto" w:fill="E7E6E6" w:themeFill="background2"/>
           </w:tcPr>
-          <w:p>
+          <w:p ns2:paraId="7E9DA1F1" ns2:textId="77777777">
             <w:r>
               <w:rPr>
                 <w:rStyle w:val="Strong"/>
@@ -4576,20 +4101,20 @@
           <w:tcPr>
             <w:tcW w:w="7435" w:type="dxa"/>
           </w:tcPr>
-          <w:p>
+          <w:p ns2:paraId="005A8C72" ns2:textId="77777777">
             <w:r>
               <w:t>{{ client_signature_customer_name }}</w:t>
             </w:r>
           </w:p>
         </w:tc>
       </w:tr>
-      <w:tr>
+      <w:tr ns2:paraId="3F578508" ns2:textId="77777777">
         <w:tc>
           <w:tcPr>
             <w:tcW w:w="3000" w:type="dxa"/>
             <w:shd w:val="clear" w:color="auto" w:fill="E7E6E6" w:themeFill="background2"/>
           </w:tcPr>
-          <w:p>
+          <w:p ns2:paraId="75AE8A4A" ns2:textId="77777777">
             <w:r>
               <w:rPr>
                 <w:rStyle w:val="Strong"/>
@@ -4602,20 +4127,20 @@
           <w:tcPr>
             <w:tcW w:w="7435" w:type="dxa"/>
           </w:tcPr>
-          <w:p>
+          <w:p ns2:paraId="43FC4107" ns2:textId="77777777">
             <w:r>
               <w:t>{{ client_signature_person_name }}</w:t>
             </w:r>
           </w:p>
         </w:tc>
       </w:tr>
-      <w:tr>
+      <w:tr ns2:paraId="1BDC40FA" ns2:textId="77777777">
         <w:tc>
           <w:tcPr>
             <w:tcW w:w="3000" w:type="dxa"/>
             <w:shd w:val="clear" w:color="auto" w:fill="E7E6E6" w:themeFill="background2"/>
           </w:tcPr>
-          <w:p>
+          <w:p ns2:paraId="1B97556E" ns2:textId="77777777">
             <w:r>
               <w:rPr>
                 <w:rStyle w:val="Strong"/>
@@ -4628,20 +4153,20 @@
           <w:tcPr>
             <w:tcW w:w="7435" w:type="dxa"/>
           </w:tcPr>
-          <w:p>
+          <w:p ns2:paraId="17B5286B" ns2:textId="77777777">
             <w:r>
               <w:t>{{ client_signature_designation }}</w:t>
             </w:r>
           </w:p>
         </w:tc>
       </w:tr>
-      <w:tr>
+      <w:tr ns2:paraId="63D10036" ns2:textId="77777777">
         <w:tc>
           <w:tcPr>
             <w:tcW w:w="3000" w:type="dxa"/>
             <w:shd w:val="clear" w:color="auto" w:fill="E7E6E6" w:themeFill="background2"/>
           </w:tcPr>
-          <w:p>
+          <w:p ns2:paraId="6BB581D2" ns2:textId="77777777">
             <w:r>
               <w:rPr>
                 <w:rStyle w:val="Strong"/>
@@ -4654,7 +4179,7 @@
           <w:tcPr>
             <w:tcW w:w="7435" w:type="dxa"/>
           </w:tcPr>
-          <w:p>
+          <w:p ns2:paraId="2D424EAD" ns2:textId="77777777">
             <w:r>
               <w:t>{{ client_signature_date }}</w:t>
             </w:r>
@@ -4662,7 +4187,7 @@
         </w:tc>
       </w:tr>
     </w:tbl>
-    <w:p>
+    <w:p ns2:paraId="299C74EB" ns2:textId="77777777">
       <w:pPr>
         <w:spacing w:after="0" w:line="240" w:lineRule="auto"/>
         <w:rPr>
@@ -4673,7 +4198,7 @@
         </w:rPr>
       </w:pPr>
     </w:p>
-    <w:p/>
+    <w:p ns2:paraId="7557B54C" ns2:textId="77777777"/>
     <w:sectPr>
       <w:footerReference w:type="default" r:id="rId10"/>
       <w:pgSz w:w="12240" w:h="15840"/>

</xml_diff>

<commit_message>
Implement Phase 3 APN DOCX resource export
</commit_message>
<xml_diff>
--- a/agent/templates/apn-poc-template_v2.docx
+++ b/agent/templates/apn-poc-template_v2.docx
@@ -3705,7 +3705,7 @@
       </w:r>
       <w:bookmarkEnd w:id="11"/>
     </w:p>
-    <w:p ns2:paraId="5556FCC4" ns2:textId="77777777">
+    <w:p>
       <w:pPr>
         <w:rPr>
           <w:rStyle w:val="Strong"/>
@@ -3718,35 +3718,6 @@
         <w:t>Partner Technical Team</w:t>
       </w:r>
     </w:p>
-    <w:p ns2:paraId="052BCBA4" ns2:textId="77777777">
-      <w:r>
-        <w:t>{%p for member in partner_technical_team %}</w:t>
-      </w:r>
-    </w:p>
-    <w:p ns2:paraId="7C2FFD49" ns2:textId="77777777">
-      <w:pPr>
-        <w:pStyle w:val="ListParagraph"/>
-        <w:numPr>
-          <w:ilvl w:val="0"/>
-          <w:numId w:val="5"/>
-        </w:numPr>
-      </w:pPr>
-      <w:r>
-        <w:rPr>
-          <w:rStyle w:val="Strong"/>
-        </w:rPr>
-        <w:t xml:space="preserve">{{ member.role }} : </w:t>
-      </w:r>
-      <w:r>
-        <w:t>{{ member.name }}</w:t>
-      </w:r>
-    </w:p>
-    <w:p ns2:paraId="5814C7E3" ns2:textId="77777777">
-      <w:r>
-        <w:t>{%p endfor %}</w:t>
-      </w:r>
-    </w:p>
-    <w:p ns2:paraId="30453EBC" ns2:textId="77777777"/>
     <w:tbl>
       <w:tblPr>
         <w:tblStyle w:val="TableGrid"/>
@@ -3754,16 +3725,17 @@
         <w:tblLook w:val="04A0" w:firstRow="1" w:lastRow="0" w:firstColumn="1" w:lastColumn="0" w:noHBand="0" w:noVBand="1"/>
       </w:tblPr>
       <w:tblGrid>
-        <w:gridCol w:w="2245"/>
-        <w:gridCol w:w="2692"/>
+        <w:gridCol w:w="2200"/>
+        <w:gridCol w:w="3000"/>
+        <w:gridCol w:w="3600"/>
       </w:tblGrid>
-      <w:tr ns2:paraId="6F385D90" ns2:textId="77777777">
-        <w:tc>
-          <w:tcPr>
-            <w:tcW w:w="2245" w:type="dxa"/>
+      <w:tr>
+        <w:tc>
+          <w:tcPr>
+            <w:tcW w:w="2200" w:type="dxa"/>
             <w:shd w:val="clear" w:color="auto" w:fill="D9D9D9" w:themeFill="background1" w:themeFillShade="D9"/>
           </w:tcPr>
-          <w:p ns2:paraId="3CCADCB0" ns2:textId="77777777">
+          <w:p>
             <w:pPr>
               <w:rPr>
                 <w:b/>
@@ -3773,16 +3745,16 @@
               <w:rPr>
                 <w:b/>
               </w:rPr>
-              <w:t>Resource</w:t>
-            </w:r>
-          </w:p>
-        </w:tc>
-        <w:tc>
-          <w:tcPr>
-            <w:tcW w:w="2026" w:type="dxa"/>
+              <w:t>Role</w:t>
+            </w:r>
+          </w:p>
+        </w:tc>
+        <w:tc>
+          <w:tcPr>
+            <w:tcW w:w="3000" w:type="dxa"/>
             <w:shd w:val="clear" w:color="auto" w:fill="D9D9D9" w:themeFill="background1" w:themeFillShade="D9"/>
           </w:tcPr>
-          <w:p ns2:paraId="4D812A16" ns2:textId="77777777">
+          <w:p>
             <w:pPr>
               <w:rPr>
                 <w:b/>
@@ -3792,86 +3764,1238 @@
               <w:rPr>
                 <w:b/>
               </w:rPr>
-              <w:t>Rate (USD) / Hour</w:t>
+              <w:t>Name</w:t>
+            </w:r>
+          </w:p>
+        </w:tc>
+        <w:tc>
+          <w:tcPr>
+            <w:tcW w:w="3600" w:type="dxa"/>
+            <w:shd w:val="clear" w:color="auto" w:fill="D9D9D9" w:themeFill="background1" w:themeFillShade="D9"/>
+          </w:tcPr>
+          <w:p>
+            <w:pPr>
+              <w:rPr>
+                <w:b/>
+              </w:rPr>
+            </w:pPr>
+            <w:r>
+              <w:rPr>
+                <w:b/>
+              </w:rPr>
+              <w:t>Contact</w:t>
             </w:r>
           </w:p>
         </w:tc>
       </w:tr>
-      <w:tr ns2:paraId="60209EDA" ns2:textId="77777777">
-        <w:tc>
-          <w:tcPr>
-            <w:tcW w:w="2245" w:type="dxa"/>
-          </w:tcPr>
-          <w:p ns2:paraId="606A59C4" ns2:textId="77777777">
-            <w:r>
-              <w:t>{%tr for role in role_rates %}</w:t>
-            </w:r>
-          </w:p>
-        </w:tc>
-        <w:tc>
-          <w:tcPr>
-            <w:tcW w:w="2026" w:type="dxa"/>
-          </w:tcPr>
-          <w:p ns2:paraId="6B02A92A" ns2:textId="77777777">
-            <w:r>
+      <w:tr>
+        <w:tc>
+          <w:tcPr>
+            <w:tcW w:w="2200" w:type="dxa"/>
+          </w:tcPr>
+          <w:p>
+            <w:pPr>
+              <w:rPr/>
+            </w:pPr>
+            <w:r>
+              <w:rPr/>
+              <w:t>{%tr for member in partner_technical_team %}</w:t>
+            </w:r>
+          </w:p>
+        </w:tc>
+        <w:tc>
+          <w:tcPr>
+            <w:tcW w:w="3000" w:type="dxa"/>
+          </w:tcPr>
+          <w:p>
+            <w:pPr>
+              <w:rPr/>
+            </w:pPr>
+            <w:r>
+              <w:rPr/>
               <w:t/>
             </w:r>
           </w:p>
         </w:tc>
+        <w:tc>
+          <w:tcPr>
+            <w:tcW w:w="3600" w:type="dxa"/>
+          </w:tcPr>
+          <w:p>
+            <w:pPr>
+              <w:rPr/>
+            </w:pPr>
+            <w:r>
+              <w:rPr/>
+              <w:t/>
+            </w:r>
+          </w:p>
+        </w:tc>
       </w:tr>
-      <w:tr ns2:paraId="32E13E41" ns2:textId="77777777">
-        <w:tc>
-          <w:tcPr>
-            <w:tcW w:w="2245" w:type="dxa"/>
-          </w:tcPr>
-          <w:p ns2:paraId="5E7AEEEE" ns2:textId="77777777">
-            <w:r>
-              <w:t>{{ role.role }} ({{ role.count }})</w:t>
-            </w:r>
-          </w:p>
-        </w:tc>
-        <w:tc>
-          <w:tcPr>
-            <w:tcW w:w="2026" w:type="dxa"/>
-          </w:tcPr>
-          <w:p ns2:paraId="2D2D0338" ns2:textId="77777777">
-            <w:r>
-              <w:t>{{ role.rate }}</w:t>
+      <w:tr>
+        <w:tc>
+          <w:tcPr>
+            <w:tcW w:w="2200" w:type="dxa"/>
+          </w:tcPr>
+          <w:p>
+            <w:pPr>
+              <w:rPr/>
+            </w:pPr>
+            <w:r>
+              <w:rPr/>
+              <w:t>{{ member.role }}</w:t>
+            </w:r>
+          </w:p>
+        </w:tc>
+        <w:tc>
+          <w:tcPr>
+            <w:tcW w:w="3000" w:type="dxa"/>
+          </w:tcPr>
+          <w:p>
+            <w:pPr>
+              <w:rPr/>
+            </w:pPr>
+            <w:r>
+              <w:rPr/>
+              <w:t>{{ member.name }}</w:t>
+            </w:r>
+          </w:p>
+        </w:tc>
+        <w:tc>
+          <w:tcPr>
+            <w:tcW w:w="3600" w:type="dxa"/>
+          </w:tcPr>
+          <w:p>
+            <w:pPr>
+              <w:rPr/>
+            </w:pPr>
+            <w:r>
+              <w:rPr/>
+              <w:t>{{ member.contact }}</w:t>
             </w:r>
           </w:p>
         </w:tc>
       </w:tr>
-      <w:tr ns2:paraId="57A5BF78" ns2:textId="77777777">
-        <w:tc>
-          <w:tcPr>
-            <w:tcW w:w="2245" w:type="dxa"/>
-          </w:tcPr>
-          <w:p ns2:paraId="061E2553" ns2:textId="77777777">
-            <w:r>
-              <w:t xml:space="preserve">{%tr endfor %}</w:t>
-            </w:r>
-            <w:r>
-              <w:rPr>
-                <w:sz w:val="18"/>
-              </w:rPr>
+      <w:tr>
+        <w:tc>
+          <w:tcPr>
+            <w:tcW w:w="2200" w:type="dxa"/>
+          </w:tcPr>
+          <w:p>
+            <w:pPr>
+              <w:rPr/>
+            </w:pPr>
+            <w:r>
+              <w:rPr/>
+              <w:t>{%tr endfor %}</w:t>
+            </w:r>
+          </w:p>
+        </w:tc>
+        <w:tc>
+          <w:tcPr>
+            <w:tcW w:w="3000" w:type="dxa"/>
+          </w:tcPr>
+          <w:p>
+            <w:pPr>
+              <w:rPr/>
+            </w:pPr>
+            <w:r>
+              <w:rPr/>
               <w:t/>
             </w:r>
           </w:p>
         </w:tc>
         <w:tc>
           <w:tcPr>
-            <w:tcW w:w="2026" w:type="dxa"/>
-          </w:tcPr>
-          <w:p ns2:paraId="4D8A8F3C" ns2:textId="77777777">
-            <w:r>
+            <w:tcW w:w="3600" w:type="dxa"/>
+          </w:tcPr>
+          <w:p>
+            <w:pPr>
+              <w:rPr/>
+            </w:pPr>
+            <w:r>
+              <w:rPr/>
               <w:t/>
             </w:r>
           </w:p>
         </w:tc>
       </w:tr>
     </w:tbl>
-    <w:p ns2:paraId="0CAF5429" ns2:textId="77777777"/>
-    <w:p ns2:paraId="773EF6CB" ns2:textId="77777777"/>
+    <w:p>
+      <w:r>
+        <w:t/>
+      </w:r>
+    </w:p>
+    <w:p>
+      <w:pPr>
+        <w:rPr>
+          <w:rStyle w:val="Strong"/>
+        </w:rPr>
+      </w:pPr>
+      <w:r>
+        <w:rPr>
+          <w:rStyle w:val="Strong"/>
+        </w:rPr>
+        <w:t>Role Rates</w:t>
+      </w:r>
+    </w:p>
+    <w:tbl>
+      <w:tblPr>
+        <w:tblStyle w:val="TableGrid"/>
+        <w:tblW w:w="0" w:type="auto"/>
+        <w:tblLook w:val="04A0" w:firstRow="1" w:lastRow="0" w:firstColumn="1" w:lastColumn="0" w:noHBand="0" w:noVBand="1"/>
+      </w:tblPr>
+      <w:tblGrid>
+        <w:gridCol w:w="2200"/>
+        <w:gridCol w:w="1100"/>
+        <w:gridCol w:w="3600"/>
+        <w:gridCol w:w="1800"/>
+      </w:tblGrid>
+      <w:tr>
+        <w:tc>
+          <w:tcPr>
+            <w:tcW w:w="2200" w:type="dxa"/>
+            <w:shd w:val="clear" w:color="auto" w:fill="D9D9D9" w:themeFill="background1" w:themeFillShade="D9"/>
+          </w:tcPr>
+          <w:p>
+            <w:pPr>
+              <w:rPr>
+                <w:b/>
+              </w:rPr>
+            </w:pPr>
+            <w:r>
+              <w:rPr>
+                <w:b/>
+              </w:rPr>
+              <w:t>Role</w:t>
+            </w:r>
+          </w:p>
+        </w:tc>
+        <w:tc>
+          <w:tcPr>
+            <w:tcW w:w="1100" w:type="dxa"/>
+            <w:shd w:val="clear" w:color="auto" w:fill="D9D9D9" w:themeFill="background1" w:themeFillShade="D9"/>
+          </w:tcPr>
+          <w:p>
+            <w:pPr>
+              <w:rPr>
+                <w:b/>
+              </w:rPr>
+            </w:pPr>
+            <w:r>
+              <w:rPr>
+                <w:b/>
+              </w:rPr>
+              <w:t>Count</w:t>
+            </w:r>
+          </w:p>
+        </w:tc>
+        <w:tc>
+          <w:tcPr>
+            <w:tcW w:w="3600" w:type="dxa"/>
+            <w:shd w:val="clear" w:color="auto" w:fill="D9D9D9" w:themeFill="background1" w:themeFillShade="D9"/>
+          </w:tcPr>
+          <w:p>
+            <w:pPr>
+              <w:rPr>
+                <w:b/>
+              </w:rPr>
+            </w:pPr>
+            <w:r>
+              <w:rPr>
+                <w:b/>
+              </w:rPr>
+              <w:t>Members</w:t>
+            </w:r>
+          </w:p>
+        </w:tc>
+        <w:tc>
+          <w:tcPr>
+            <w:tcW w:w="1800" w:type="dxa"/>
+            <w:shd w:val="clear" w:color="auto" w:fill="D9D9D9" w:themeFill="background1" w:themeFillShade="D9"/>
+          </w:tcPr>
+          <w:p>
+            <w:pPr>
+              <w:rPr>
+                <w:b/>
+              </w:rPr>
+            </w:pPr>
+            <w:r>
+              <w:rPr>
+                <w:b/>
+              </w:rPr>
+              <w:t>Rate / Hour</w:t>
+            </w:r>
+          </w:p>
+        </w:tc>
+      </w:tr>
+      <w:tr>
+        <w:tc>
+          <w:tcPr>
+            <w:tcW w:w="2200" w:type="dxa"/>
+          </w:tcPr>
+          <w:p>
+            <w:pPr>
+              <w:rPr/>
+            </w:pPr>
+            <w:r>
+              <w:rPr/>
+              <w:t>{%tr for role in role_rates %}</w:t>
+            </w:r>
+          </w:p>
+        </w:tc>
+        <w:tc>
+          <w:tcPr>
+            <w:tcW w:w="1100" w:type="dxa"/>
+          </w:tcPr>
+          <w:p>
+            <w:pPr>
+              <w:rPr/>
+            </w:pPr>
+            <w:r>
+              <w:rPr/>
+              <w:t/>
+            </w:r>
+          </w:p>
+        </w:tc>
+        <w:tc>
+          <w:tcPr>
+            <w:tcW w:w="3600" w:type="dxa"/>
+          </w:tcPr>
+          <w:p>
+            <w:pPr>
+              <w:rPr/>
+            </w:pPr>
+            <w:r>
+              <w:rPr/>
+              <w:t/>
+            </w:r>
+          </w:p>
+        </w:tc>
+        <w:tc>
+          <w:tcPr>
+            <w:tcW w:w="1800" w:type="dxa"/>
+          </w:tcPr>
+          <w:p>
+            <w:pPr>
+              <w:rPr/>
+            </w:pPr>
+            <w:r>
+              <w:rPr/>
+              <w:t/>
+            </w:r>
+          </w:p>
+        </w:tc>
+      </w:tr>
+      <w:tr>
+        <w:tc>
+          <w:tcPr>
+            <w:tcW w:w="2200" w:type="dxa"/>
+          </w:tcPr>
+          <w:p>
+            <w:pPr>
+              <w:rPr/>
+            </w:pPr>
+            <w:r>
+              <w:rPr/>
+              <w:t>{{ role.role }}</w:t>
+            </w:r>
+          </w:p>
+        </w:tc>
+        <w:tc>
+          <w:tcPr>
+            <w:tcW w:w="1100" w:type="dxa"/>
+          </w:tcPr>
+          <w:p>
+            <w:pPr>
+              <w:rPr/>
+            </w:pPr>
+            <w:r>
+              <w:rPr/>
+              <w:t>{{ role.count }}</w:t>
+            </w:r>
+          </w:p>
+        </w:tc>
+        <w:tc>
+          <w:tcPr>
+            <w:tcW w:w="3600" w:type="dxa"/>
+          </w:tcPr>
+          <w:p>
+            <w:pPr>
+              <w:rPr/>
+            </w:pPr>
+            <w:r>
+              <w:rPr/>
+              <w:t>{{ role.members }}</w:t>
+            </w:r>
+          </w:p>
+        </w:tc>
+        <w:tc>
+          <w:tcPr>
+            <w:tcW w:w="1800" w:type="dxa"/>
+          </w:tcPr>
+          <w:p>
+            <w:pPr>
+              <w:rPr/>
+            </w:pPr>
+            <w:r>
+              <w:rPr/>
+              <w:t>{{ role.rate_display }}</w:t>
+            </w:r>
+          </w:p>
+        </w:tc>
+      </w:tr>
+      <w:tr>
+        <w:tc>
+          <w:tcPr>
+            <w:tcW w:w="2200" w:type="dxa"/>
+          </w:tcPr>
+          <w:p>
+            <w:pPr>
+              <w:rPr/>
+            </w:pPr>
+            <w:r>
+              <w:rPr/>
+              <w:t>{%tr endfor %}</w:t>
+            </w:r>
+          </w:p>
+        </w:tc>
+        <w:tc>
+          <w:tcPr>
+            <w:tcW w:w="1100" w:type="dxa"/>
+          </w:tcPr>
+          <w:p>
+            <w:pPr>
+              <w:rPr/>
+            </w:pPr>
+            <w:r>
+              <w:rPr/>
+              <w:t/>
+            </w:r>
+          </w:p>
+        </w:tc>
+        <w:tc>
+          <w:tcPr>
+            <w:tcW w:w="3600" w:type="dxa"/>
+          </w:tcPr>
+          <w:p>
+            <w:pPr>
+              <w:rPr/>
+            </w:pPr>
+            <w:r>
+              <w:rPr/>
+              <w:t/>
+            </w:r>
+          </w:p>
+        </w:tc>
+        <w:tc>
+          <w:tcPr>
+            <w:tcW w:w="1800" w:type="dxa"/>
+          </w:tcPr>
+          <w:p>
+            <w:pPr>
+              <w:rPr/>
+            </w:pPr>
+            <w:r>
+              <w:rPr/>
+              <w:t/>
+            </w:r>
+          </w:p>
+        </w:tc>
+      </w:tr>
+    </w:tbl>
+    <w:p>
+      <w:r>
+        <w:t/>
+      </w:r>
+    </w:p>
+    <w:p>
+      <w:pPr>
+        <w:rPr>
+          <w:rStyle w:val="Strong"/>
+        </w:rPr>
+      </w:pPr>
+      <w:r>
+        <w:rPr>
+          <w:rStyle w:val="Strong"/>
+        </w:rPr>
+        <w:t>Phase Hours Matrix</w:t>
+      </w:r>
+    </w:p>
+    <w:tbl>
+      <w:tblPr>
+        <w:tblStyle w:val="TableGrid"/>
+        <w:tblW w:w="0" w:type="auto"/>
+        <w:tblLook w:val="04A0" w:firstRow="1" w:lastRow="0" w:firstColumn="1" w:lastColumn="0" w:noHBand="0" w:noVBand="1"/>
+      </w:tblPr>
+      <w:tblGrid>
+        <w:gridCol w:w="2600"/>
+        <w:gridCol w:w="2600"/>
+        <w:gridCol w:w="1300"/>
+        <w:gridCol w:w="1300"/>
+        <w:gridCol w:w="1600"/>
+      </w:tblGrid>
+      <w:tr>
+        <w:tc>
+          <w:tcPr>
+            <w:tcW w:w="2600" w:type="dxa"/>
+            <w:shd w:val="clear" w:color="auto" w:fill="D9D9D9" w:themeFill="background1" w:themeFillShade="D9"/>
+          </w:tcPr>
+          <w:p>
+            <w:pPr>
+              <w:rPr>
+                <w:b/>
+              </w:rPr>
+            </w:pPr>
+            <w:r>
+              <w:rPr>
+                <w:b/>
+              </w:rPr>
+              <w:t>Phase</w:t>
+            </w:r>
+          </w:p>
+        </w:tc>
+        <w:tc>
+          <w:tcPr>
+            <w:tcW w:w="2600" w:type="dxa"/>
+            <w:shd w:val="clear" w:color="auto" w:fill="D9D9D9" w:themeFill="background1" w:themeFillShade="D9"/>
+          </w:tcPr>
+          <w:p>
+            <w:pPr>
+              <w:rPr>
+                <w:b/>
+              </w:rPr>
+            </w:pPr>
+            <w:r>
+              <w:rPr>
+                <w:b/>
+              </w:rPr>
+              <w:t>Role</w:t>
+            </w:r>
+          </w:p>
+        </w:tc>
+        <w:tc>
+          <w:tcPr>
+            <w:tcW w:w="1300" w:type="dxa"/>
+            <w:shd w:val="clear" w:color="auto" w:fill="D9D9D9" w:themeFill="background1" w:themeFillShade="D9"/>
+          </w:tcPr>
+          <w:p>
+            <w:pPr>
+              <w:rPr>
+                <w:b/>
+              </w:rPr>
+            </w:pPr>
+            <w:r>
+              <w:rPr>
+                <w:b/>
+              </w:rPr>
+              <w:t>Hours</w:t>
+            </w:r>
+          </w:p>
+        </w:tc>
+        <w:tc>
+          <w:tcPr>
+            <w:tcW w:w="1300" w:type="dxa"/>
+            <w:shd w:val="clear" w:color="auto" w:fill="D9D9D9" w:themeFill="background1" w:themeFillShade="D9"/>
+          </w:tcPr>
+          <w:p>
+            <w:pPr>
+              <w:rPr>
+                <w:b/>
+              </w:rPr>
+            </w:pPr>
+            <w:r>
+              <w:rPr>
+                <w:b/>
+              </w:rPr>
+              <w:t>Rate</w:t>
+            </w:r>
+          </w:p>
+        </w:tc>
+        <w:tc>
+          <w:tcPr>
+            <w:tcW w:w="1600" w:type="dxa"/>
+            <w:shd w:val="clear" w:color="auto" w:fill="D9D9D9" w:themeFill="background1" w:themeFillShade="D9"/>
+          </w:tcPr>
+          <w:p>
+            <w:pPr>
+              <w:rPr>
+                <w:b/>
+              </w:rPr>
+            </w:pPr>
+            <w:r>
+              <w:rPr>
+                <w:b/>
+              </w:rPr>
+              <w:t>Cost</w:t>
+            </w:r>
+          </w:p>
+        </w:tc>
+      </w:tr>
+      <w:tr>
+        <w:tc>
+          <w:tcPr>
+            <w:tcW w:w="2600" w:type="dxa"/>
+          </w:tcPr>
+          <w:p>
+            <w:pPr>
+              <w:rPr/>
+            </w:pPr>
+            <w:r>
+              <w:rPr/>
+              <w:t>{%tr for row in phase_hours_rows %}</w:t>
+            </w:r>
+          </w:p>
+        </w:tc>
+        <w:tc>
+          <w:tcPr>
+            <w:tcW w:w="2600" w:type="dxa"/>
+          </w:tcPr>
+          <w:p>
+            <w:pPr>
+              <w:rPr/>
+            </w:pPr>
+            <w:r>
+              <w:rPr/>
+              <w:t/>
+            </w:r>
+          </w:p>
+        </w:tc>
+        <w:tc>
+          <w:tcPr>
+            <w:tcW w:w="1300" w:type="dxa"/>
+          </w:tcPr>
+          <w:p>
+            <w:pPr>
+              <w:rPr/>
+            </w:pPr>
+            <w:r>
+              <w:rPr/>
+              <w:t/>
+            </w:r>
+          </w:p>
+        </w:tc>
+        <w:tc>
+          <w:tcPr>
+            <w:tcW w:w="1300" w:type="dxa"/>
+          </w:tcPr>
+          <w:p>
+            <w:pPr>
+              <w:rPr/>
+            </w:pPr>
+            <w:r>
+              <w:rPr/>
+              <w:t/>
+            </w:r>
+          </w:p>
+        </w:tc>
+        <w:tc>
+          <w:tcPr>
+            <w:tcW w:w="1600" w:type="dxa"/>
+          </w:tcPr>
+          <w:p>
+            <w:pPr>
+              <w:rPr/>
+            </w:pPr>
+            <w:r>
+              <w:rPr/>
+              <w:t/>
+            </w:r>
+          </w:p>
+        </w:tc>
+      </w:tr>
+      <w:tr>
+        <w:tc>
+          <w:tcPr>
+            <w:tcW w:w="2600" w:type="dxa"/>
+          </w:tcPr>
+          <w:p>
+            <w:pPr>
+              <w:rPr/>
+            </w:pPr>
+            <w:r>
+              <w:rPr/>
+              <w:t>{{ row.phase }}</w:t>
+            </w:r>
+          </w:p>
+        </w:tc>
+        <w:tc>
+          <w:tcPr>
+            <w:tcW w:w="2600" w:type="dxa"/>
+          </w:tcPr>
+          <w:p>
+            <w:pPr>
+              <w:rPr/>
+            </w:pPr>
+            <w:r>
+              <w:rPr/>
+              <w:t>{{ row.role }}</w:t>
+            </w:r>
+          </w:p>
+        </w:tc>
+        <w:tc>
+          <w:tcPr>
+            <w:tcW w:w="1300" w:type="dxa"/>
+          </w:tcPr>
+          <w:p>
+            <w:pPr>
+              <w:rPr/>
+            </w:pPr>
+            <w:r>
+              <w:rPr/>
+              <w:t>{{ row.hours_display }}</w:t>
+            </w:r>
+          </w:p>
+        </w:tc>
+        <w:tc>
+          <w:tcPr>
+            <w:tcW w:w="1300" w:type="dxa"/>
+          </w:tcPr>
+          <w:p>
+            <w:pPr>
+              <w:rPr/>
+            </w:pPr>
+            <w:r>
+              <w:rPr/>
+              <w:t>{{ row.rate_display }}</w:t>
+            </w:r>
+          </w:p>
+        </w:tc>
+        <w:tc>
+          <w:tcPr>
+            <w:tcW w:w="1600" w:type="dxa"/>
+          </w:tcPr>
+          <w:p>
+            <w:pPr>
+              <w:rPr/>
+            </w:pPr>
+            <w:r>
+              <w:rPr/>
+              <w:t>{{ row.cost_display }}</w:t>
+            </w:r>
+          </w:p>
+        </w:tc>
+      </w:tr>
+      <w:tr>
+        <w:tc>
+          <w:tcPr>
+            <w:tcW w:w="2600" w:type="dxa"/>
+          </w:tcPr>
+          <w:p>
+            <w:pPr>
+              <w:rPr/>
+            </w:pPr>
+            <w:r>
+              <w:rPr/>
+              <w:t>{%tr endfor %}</w:t>
+            </w:r>
+          </w:p>
+        </w:tc>
+        <w:tc>
+          <w:tcPr>
+            <w:tcW w:w="2600" w:type="dxa"/>
+          </w:tcPr>
+          <w:p>
+            <w:pPr>
+              <w:rPr/>
+            </w:pPr>
+            <w:r>
+              <w:rPr/>
+              <w:t/>
+            </w:r>
+          </w:p>
+        </w:tc>
+        <w:tc>
+          <w:tcPr>
+            <w:tcW w:w="1300" w:type="dxa"/>
+          </w:tcPr>
+          <w:p>
+            <w:pPr>
+              <w:rPr/>
+            </w:pPr>
+            <w:r>
+              <w:rPr/>
+              <w:t/>
+            </w:r>
+          </w:p>
+        </w:tc>
+        <w:tc>
+          <w:tcPr>
+            <w:tcW w:w="1300" w:type="dxa"/>
+          </w:tcPr>
+          <w:p>
+            <w:pPr>
+              <w:rPr/>
+            </w:pPr>
+            <w:r>
+              <w:rPr/>
+              <w:t/>
+            </w:r>
+          </w:p>
+        </w:tc>
+        <w:tc>
+          <w:tcPr>
+            <w:tcW w:w="1600" w:type="dxa"/>
+          </w:tcPr>
+          <w:p>
+            <w:pPr>
+              <w:rPr/>
+            </w:pPr>
+            <w:r>
+              <w:rPr/>
+              <w:t/>
+            </w:r>
+          </w:p>
+        </w:tc>
+      </w:tr>
+    </w:tbl>
+    <w:p>
+      <w:r>
+        <w:t/>
+      </w:r>
+    </w:p>
+    <w:p>
+      <w:pPr>
+        <w:rPr>
+          <w:rStyle w:val="Strong"/>
+        </w:rPr>
+      </w:pPr>
+      <w:r>
+        <w:rPr>
+          <w:rStyle w:val="Strong"/>
+        </w:rPr>
+        <w:t>Resource Totals</w:t>
+      </w:r>
+    </w:p>
+    <w:tbl>
+      <w:tblPr>
+        <w:tblStyle w:val="TableGrid"/>
+        <w:tblW w:w="0" w:type="auto"/>
+        <w:tblLook w:val="04A0" w:firstRow="1" w:lastRow="1" w:firstColumn="1" w:lastColumn="0" w:noHBand="0" w:noVBand="1"/>
+      </w:tblPr>
+      <w:tblGrid>
+        <w:gridCol w:w="2200"/>
+        <w:gridCol w:w="1100"/>
+        <w:gridCol w:w="1800"/>
+        <w:gridCol w:w="1600"/>
+        <w:gridCol w:w="1800"/>
+      </w:tblGrid>
+      <w:tr>
+        <w:tc>
+          <w:tcPr>
+            <w:tcW w:w="2200" w:type="dxa"/>
+            <w:shd w:val="clear" w:color="auto" w:fill="D9D9D9" w:themeFill="background1" w:themeFillShade="D9"/>
+          </w:tcPr>
+          <w:p>
+            <w:pPr>
+              <w:rPr>
+                <w:b/>
+              </w:rPr>
+            </w:pPr>
+            <w:r>
+              <w:rPr>
+                <w:b/>
+              </w:rPr>
+              <w:t>Role</w:t>
+            </w:r>
+          </w:p>
+        </w:tc>
+        <w:tc>
+          <w:tcPr>
+            <w:tcW w:w="1100" w:type="dxa"/>
+            <w:shd w:val="clear" w:color="auto" w:fill="D9D9D9" w:themeFill="background1" w:themeFillShade="D9"/>
+          </w:tcPr>
+          <w:p>
+            <w:pPr>
+              <w:rPr>
+                <w:b/>
+              </w:rPr>
+            </w:pPr>
+            <w:r>
+              <w:rPr>
+                <w:b/>
+              </w:rPr>
+              <w:t>Count</w:t>
+            </w:r>
+          </w:p>
+        </w:tc>
+        <w:tc>
+          <w:tcPr>
+            <w:tcW w:w="1800" w:type="dxa"/>
+            <w:shd w:val="clear" w:color="auto" w:fill="D9D9D9" w:themeFill="background1" w:themeFillShade="D9"/>
+          </w:tcPr>
+          <w:p>
+            <w:pPr>
+              <w:rPr>
+                <w:b/>
+              </w:rPr>
+            </w:pPr>
+            <w:r>
+              <w:rPr>
+                <w:b/>
+              </w:rPr>
+              <w:t>Total Hours</w:t>
+            </w:r>
+          </w:p>
+        </w:tc>
+        <w:tc>
+          <w:tcPr>
+            <w:tcW w:w="1600" w:type="dxa"/>
+            <w:shd w:val="clear" w:color="auto" w:fill="D9D9D9" w:themeFill="background1" w:themeFillShade="D9"/>
+          </w:tcPr>
+          <w:p>
+            <w:pPr>
+              <w:rPr>
+                <w:b/>
+              </w:rPr>
+            </w:pPr>
+            <w:r>
+              <w:rPr>
+                <w:b/>
+              </w:rPr>
+              <w:t>Rate</w:t>
+            </w:r>
+          </w:p>
+        </w:tc>
+        <w:tc>
+          <w:tcPr>
+            <w:tcW w:w="1800" w:type="dxa"/>
+            <w:shd w:val="clear" w:color="auto" w:fill="D9D9D9" w:themeFill="background1" w:themeFillShade="D9"/>
+          </w:tcPr>
+          <w:p>
+            <w:pPr>
+              <w:rPr>
+                <w:b/>
+              </w:rPr>
+            </w:pPr>
+            <w:r>
+              <w:rPr>
+                <w:b/>
+              </w:rPr>
+              <w:t>Total Cost</w:t>
+            </w:r>
+          </w:p>
+        </w:tc>
+      </w:tr>
+      <w:tr>
+        <w:tc>
+          <w:tcPr>
+            <w:tcW w:w="2200" w:type="dxa"/>
+          </w:tcPr>
+          <w:p>
+            <w:pPr>
+              <w:rPr/>
+            </w:pPr>
+            <w:r>
+              <w:rPr/>
+              <w:t>{%tr for total in phase_hours_totals %}</w:t>
+            </w:r>
+          </w:p>
+        </w:tc>
+        <w:tc>
+          <w:tcPr>
+            <w:tcW w:w="1100" w:type="dxa"/>
+          </w:tcPr>
+          <w:p>
+            <w:pPr>
+              <w:rPr/>
+            </w:pPr>
+            <w:r>
+              <w:rPr/>
+              <w:t/>
+            </w:r>
+          </w:p>
+        </w:tc>
+        <w:tc>
+          <w:tcPr>
+            <w:tcW w:w="1800" w:type="dxa"/>
+          </w:tcPr>
+          <w:p>
+            <w:pPr>
+              <w:rPr/>
+            </w:pPr>
+            <w:r>
+              <w:rPr/>
+              <w:t/>
+            </w:r>
+          </w:p>
+        </w:tc>
+        <w:tc>
+          <w:tcPr>
+            <w:tcW w:w="1600" w:type="dxa"/>
+          </w:tcPr>
+          <w:p>
+            <w:pPr>
+              <w:rPr/>
+            </w:pPr>
+            <w:r>
+              <w:rPr/>
+              <w:t/>
+            </w:r>
+          </w:p>
+        </w:tc>
+        <w:tc>
+          <w:tcPr>
+            <w:tcW w:w="1800" w:type="dxa"/>
+          </w:tcPr>
+          <w:p>
+            <w:pPr>
+              <w:rPr/>
+            </w:pPr>
+            <w:r>
+              <w:rPr/>
+              <w:t/>
+            </w:r>
+          </w:p>
+        </w:tc>
+      </w:tr>
+      <w:tr>
+        <w:tc>
+          <w:tcPr>
+            <w:tcW w:w="2200" w:type="dxa"/>
+          </w:tcPr>
+          <w:p>
+            <w:pPr>
+              <w:rPr/>
+            </w:pPr>
+            <w:r>
+              <w:rPr/>
+              <w:t>{{ total.role }}</w:t>
+            </w:r>
+          </w:p>
+        </w:tc>
+        <w:tc>
+          <w:tcPr>
+            <w:tcW w:w="1100" w:type="dxa"/>
+          </w:tcPr>
+          <w:p>
+            <w:pPr>
+              <w:rPr/>
+            </w:pPr>
+            <w:r>
+              <w:rPr/>
+              <w:t>{{ total.count }}</w:t>
+            </w:r>
+          </w:p>
+        </w:tc>
+        <w:tc>
+          <w:tcPr>
+            <w:tcW w:w="1800" w:type="dxa"/>
+          </w:tcPr>
+          <w:p>
+            <w:pPr>
+              <w:rPr/>
+            </w:pPr>
+            <w:r>
+              <w:rPr/>
+              <w:t>{{ total.hours_display }}</w:t>
+            </w:r>
+          </w:p>
+        </w:tc>
+        <w:tc>
+          <w:tcPr>
+            <w:tcW w:w="1600" w:type="dxa"/>
+          </w:tcPr>
+          <w:p>
+            <w:pPr>
+              <w:rPr/>
+            </w:pPr>
+            <w:r>
+              <w:rPr/>
+              <w:t>{{ total.rate_display }}</w:t>
+            </w:r>
+          </w:p>
+        </w:tc>
+        <w:tc>
+          <w:tcPr>
+            <w:tcW w:w="1800" w:type="dxa"/>
+          </w:tcPr>
+          <w:p>
+            <w:pPr>
+              <w:rPr/>
+            </w:pPr>
+            <w:r>
+              <w:rPr/>
+              <w:t>{{ total.cost_display }}</w:t>
+            </w:r>
+          </w:p>
+        </w:tc>
+      </w:tr>
+      <w:tr>
+        <w:tc>
+          <w:tcPr>
+            <w:tcW w:w="2200" w:type="dxa"/>
+          </w:tcPr>
+          <w:p>
+            <w:pPr>
+              <w:rPr/>
+            </w:pPr>
+            <w:r>
+              <w:rPr/>
+              <w:t>{%tr endfor %}</w:t>
+            </w:r>
+          </w:p>
+        </w:tc>
+        <w:tc>
+          <w:tcPr>
+            <w:tcW w:w="1100" w:type="dxa"/>
+          </w:tcPr>
+          <w:p>
+            <w:pPr>
+              <w:rPr/>
+            </w:pPr>
+            <w:r>
+              <w:rPr/>
+              <w:t/>
+            </w:r>
+          </w:p>
+        </w:tc>
+        <w:tc>
+          <w:tcPr>
+            <w:tcW w:w="1800" w:type="dxa"/>
+          </w:tcPr>
+          <w:p>
+            <w:pPr>
+              <w:rPr/>
+            </w:pPr>
+            <w:r>
+              <w:rPr/>
+              <w:t/>
+            </w:r>
+          </w:p>
+        </w:tc>
+        <w:tc>
+          <w:tcPr>
+            <w:tcW w:w="1600" w:type="dxa"/>
+          </w:tcPr>
+          <w:p>
+            <w:pPr>
+              <w:rPr/>
+            </w:pPr>
+            <w:r>
+              <w:rPr/>
+              <w:t/>
+            </w:r>
+          </w:p>
+        </w:tc>
+        <w:tc>
+          <w:tcPr>
+            <w:tcW w:w="1800" w:type="dxa"/>
+          </w:tcPr>
+          <w:p>
+            <w:pPr>
+              <w:rPr/>
+            </w:pPr>
+            <w:r>
+              <w:rPr/>
+              <w:t/>
+            </w:r>
+          </w:p>
+        </w:tc>
+      </w:tr>
+      <w:tr>
+        <w:tc>
+          <w:tcPr>
+            <w:tcW w:w="2200" w:type="dxa"/>
+            <w:shd w:val="clear" w:color="auto" w:fill="D9D9D9" w:themeFill="background1" w:themeFillShade="D9"/>
+          </w:tcPr>
+          <w:p>
+            <w:pPr>
+              <w:rPr>
+                <w:b/>
+              </w:rPr>
+            </w:pPr>
+            <w:r>
+              <w:rPr>
+                <w:b/>
+              </w:rPr>
+              <w:t>Grand Total</w:t>
+            </w:r>
+          </w:p>
+        </w:tc>
+        <w:tc>
+          <w:tcPr>
+            <w:tcW w:w="1100" w:type="dxa"/>
+            <w:shd w:val="clear" w:color="auto" w:fill="D9D9D9" w:themeFill="background1" w:themeFillShade="D9"/>
+          </w:tcPr>
+          <w:p>
+            <w:pPr>
+              <w:rPr>
+                <w:b/>
+              </w:rPr>
+            </w:pPr>
+            <w:r>
+              <w:rPr>
+                <w:b/>
+              </w:rPr>
+              <w:t/>
+            </w:r>
+          </w:p>
+        </w:tc>
+        <w:tc>
+          <w:tcPr>
+            <w:tcW w:w="1800" w:type="dxa"/>
+            <w:shd w:val="clear" w:color="auto" w:fill="D9D9D9" w:themeFill="background1" w:themeFillShade="D9"/>
+          </w:tcPr>
+          <w:p>
+            <w:pPr>
+              <w:rPr>
+                <w:b/>
+              </w:rPr>
+            </w:pPr>
+            <w:r>
+              <w:rPr>
+                <w:b/>
+              </w:rPr>
+              <w:t>{{ grand_total_hours }}</w:t>
+            </w:r>
+          </w:p>
+        </w:tc>
+        <w:tc>
+          <w:tcPr>
+            <w:tcW w:w="1600" w:type="dxa"/>
+            <w:shd w:val="clear" w:color="auto" w:fill="D9D9D9" w:themeFill="background1" w:themeFillShade="D9"/>
+          </w:tcPr>
+          <w:p>
+            <w:pPr>
+              <w:rPr>
+                <w:b/>
+              </w:rPr>
+            </w:pPr>
+            <w:r>
+              <w:rPr>
+                <w:b/>
+              </w:rPr>
+              <w:t/>
+            </w:r>
+          </w:p>
+        </w:tc>
+        <w:tc>
+          <w:tcPr>
+            <w:tcW w:w="1800" w:type="dxa"/>
+            <w:shd w:val="clear" w:color="auto" w:fill="D9D9D9" w:themeFill="background1" w:themeFillShade="D9"/>
+          </w:tcPr>
+          <w:p>
+            <w:pPr>
+              <w:rPr>
+                <w:b/>
+              </w:rPr>
+            </w:pPr>
+            <w:r>
+              <w:rPr>
+                <w:b/>
+              </w:rPr>
+              <w:t>{{ grand_total_cost }}</w:t>
+            </w:r>
+          </w:p>
+        </w:tc>
+      </w:tr>
+    </w:tbl>
+    <w:p>
+      <w:r>
+        <w:t/>
+      </w:r>
+    </w:p>
     <w:p ns2:paraId="458EBBB6" ns2:textId="77777777">
       <w:r>
         <w:t>Cost Contribution distribution between Partner, Customer, AWS:</w:t>

</xml_diff>

<commit_message>
Render APN phase hours as dynamic matrix
</commit_message>
<xml_diff>
--- a/agent/templates/apn-poc-template_v2.docx
+++ b/agent/templates/apn-poc-template_v2.docx
@@ -1,6 +1,6 @@
 
 <file path=word/document.xml><?xml version="1.0" encoding="utf-8"?>
-<w:document xmlns:a="http://schemas.openxmlformats.org/drawingml/2006/main" xmlns:ns1="http://schemas.openxmlformats.org/markup-compatibility/2006" xmlns:ns2="http://schemas.microsoft.com/office/word/2010/wordml" xmlns:ns4="http://schemas.microsoft.com/office/word/2010/wordprocessingDrawing" xmlns:ns8="http://schemas.microsoft.com/office/drawing/2010/main" xmlns:pic="http://schemas.openxmlformats.org/drawingml/2006/picture" xmlns:r="http://schemas.openxmlformats.org/officeDocument/2006/relationships" xmlns:w="http://schemas.openxmlformats.org/wordprocessingml/2006/main" xmlns:wp="http://schemas.openxmlformats.org/drawingml/2006/wordprocessingDrawing" ns1:Ignorable="w14 w15 w16se w16cid w16 w16cex w16sdtdh wp14">
+<w:document xmlns:ns1="http://schemas.openxmlformats.org/markup-compatibility/2006" xmlns:ns2="http://schemas.microsoft.com/office/word/2010/wordml" xmlns:ns3="http://schemas.openxmlformats.org/drawingml/2006/wordprocessingDrawing" xmlns:ns4="http://schemas.microsoft.com/office/word/2010/wordprocessingDrawing" xmlns:ns5="http://schemas.openxmlformats.org/drawingml/2006/main" xmlns:ns6="http://schemas.openxmlformats.org/drawingml/2006/picture" xmlns:ns7="http://schemas.openxmlformats.org/officeDocument/2006/relationships" xmlns:ns8="http://schemas.microsoft.com/office/drawing/2010/main" xmlns:w="http://schemas.openxmlformats.org/wordprocessingml/2006/main" ns1:Ignorable="w14 w15 w16se w16cid w16 w16cex w16sdtdh wp14">
   <w:body>
     <w:p ns2:paraId="1B93100F" ns2:textId="77777777">
       <w:pPr>
@@ -12,52 +12,52 @@
           <w:lang w:eastAsia="zh-CN"/>
         </w:rPr>
         <w:drawing>
-          <wp:inline distT="0" distB="0" distL="0" distR="0" ns4:anchorId="0455B90A" ns4:editId="67A878E4">
-            <wp:extent cx="1156566" cy="314325"/>
-            <wp:effectExtent l="0" t="0" r="5715" b="0"/>
-            <wp:docPr id="2" name="Picture 2" descr="cid:image001.png@01D32FAD.E0890480"/>
-            <wp:cNvGraphicFramePr>
-              <a:graphicFrameLocks noChangeAspect="1"/>
-            </wp:cNvGraphicFramePr>
-            <a:graphic>
-              <a:graphicData uri="http://schemas.openxmlformats.org/drawingml/2006/picture">
-                <pic:pic>
-                  <pic:nvPicPr>
-                    <pic:cNvPr id="0" name="Picture 1" descr="cid:image001.png@01D32FAD.E0890480"/>
-                    <pic:cNvPicPr>
-                      <a:picLocks noChangeAspect="1" noChangeArrowheads="1"/>
-                    </pic:cNvPicPr>
-                  </pic:nvPicPr>
-                  <pic:blipFill>
-                    <a:blip r:embed="rId8" r:link="rId9">
-                      <a:extLst>
-                        <a:ext uri="{28A0092B-C50C-407E-A947-70E740481C1C}">
+          <ns3:inline distT="0" distB="0" distL="0" distR="0" ns4:anchorId="0455B90A" ns4:editId="67A878E4">
+            <ns3:extent cx="1156566" cy="314325"/>
+            <ns3:effectExtent l="0" t="0" r="5715" b="0"/>
+            <ns3:docPr id="2" name="Picture 2" descr="cid:image001.png@01D32FAD.E0890480"/>
+            <ns3:cNvGraphicFramePr>
+              <ns5:graphicFrameLocks noChangeAspect="1"/>
+            </ns3:cNvGraphicFramePr>
+            <ns5:graphic>
+              <ns5:graphicData uri="http://schemas.openxmlformats.org/drawingml/2006/picture">
+                <ns6:pic>
+                  <ns6:nvPicPr>
+                    <ns6:cNvPr id="0" name="Picture 1" descr="cid:image001.png@01D32FAD.E0890480"/>
+                    <ns6:cNvPicPr>
+                      <ns5:picLocks noChangeAspect="1" noChangeArrowheads="1"/>
+                    </ns6:cNvPicPr>
+                  </ns6:nvPicPr>
+                  <ns6:blipFill>
+                    <ns5:blip ns7:embed="rId8" ns7:link="rId9">
+                      <ns5:extLst>
+                        <ns5:ext uri="{28A0092B-C50C-407E-A947-70E740481C1C}">
                           <ns8:useLocalDpi val="0"/>
-                        </a:ext>
-                      </a:extLst>
-                    </a:blip>
-                    <a:srcRect/>
-                    <a:stretch>
-                      <a:fillRect/>
-                    </a:stretch>
-                  </pic:blipFill>
-                  <pic:spPr bwMode="auto">
-                    <a:xfrm>
-                      <a:off x="0" y="0"/>
-                      <a:ext cx="1187284" cy="322673"/>
-                    </a:xfrm>
-                    <a:prstGeom prst="rect">
-                      <a:avLst/>
-                    </a:prstGeom>
-                    <a:noFill/>
-                    <a:ln>
-                      <a:noFill/>
-                    </a:ln>
-                  </pic:spPr>
-                </pic:pic>
-              </a:graphicData>
-            </a:graphic>
-          </wp:inline>
+                        </ns5:ext>
+                      </ns5:extLst>
+                    </ns5:blip>
+                    <ns5:srcRect/>
+                    <ns5:stretch>
+                      <ns5:fillRect/>
+                    </ns5:stretch>
+                  </ns6:blipFill>
+                  <ns6:spPr bwMode="auto">
+                    <ns5:xfrm>
+                      <ns5:off x="0" y="0"/>
+                      <ns5:ext cx="1187284" cy="322673"/>
+                    </ns5:xfrm>
+                    <ns5:prstGeom prst="rect">
+                      <ns5:avLst/>
+                    </ns5:prstGeom>
+                    <ns5:noFill/>
+                    <ns5:ln>
+                      <ns5:noFill/>
+                    </ns5:ln>
+                  </ns6:spPr>
+                </ns6:pic>
+              </ns5:graphicData>
+            </ns5:graphic>
+          </ns3:inline>
         </w:drawing>
       </w:r>
     </w:p>
@@ -4222,775 +4222,11 @@
         <w:t>Phase Hours Matrix</w:t>
       </w:r>
     </w:p>
-    <w:tbl>
-      <w:tblPr>
-        <w:tblStyle w:val="TableGrid"/>
-        <w:tblW w:w="0" w:type="auto"/>
-        <w:tblLook w:val="04A0" w:firstRow="1" w:lastRow="0" w:firstColumn="1" w:lastColumn="0" w:noHBand="0" w:noVBand="1"/>
-      </w:tblPr>
-      <w:tblGrid>
-        <w:gridCol w:w="2600"/>
-        <w:gridCol w:w="2600"/>
-        <w:gridCol w:w="1300"/>
-        <w:gridCol w:w="1300"/>
-        <w:gridCol w:w="1600"/>
-      </w:tblGrid>
-      <w:tr>
-        <w:tc>
-          <w:tcPr>
-            <w:tcW w:w="2600" w:type="dxa"/>
-            <w:shd w:val="clear" w:color="auto" w:fill="D9D9D9" w:themeFill="background1" w:themeFillShade="D9"/>
-          </w:tcPr>
-          <w:p>
-            <w:pPr>
-              <w:rPr>
-                <w:b/>
-              </w:rPr>
-            </w:pPr>
-            <w:r>
-              <w:rPr>
-                <w:b/>
-              </w:rPr>
-              <w:t>Phase</w:t>
-            </w:r>
-          </w:p>
-        </w:tc>
-        <w:tc>
-          <w:tcPr>
-            <w:tcW w:w="2600" w:type="dxa"/>
-            <w:shd w:val="clear" w:color="auto" w:fill="D9D9D9" w:themeFill="background1" w:themeFillShade="D9"/>
-          </w:tcPr>
-          <w:p>
-            <w:pPr>
-              <w:rPr>
-                <w:b/>
-              </w:rPr>
-            </w:pPr>
-            <w:r>
-              <w:rPr>
-                <w:b/>
-              </w:rPr>
-              <w:t>Role</w:t>
-            </w:r>
-          </w:p>
-        </w:tc>
-        <w:tc>
-          <w:tcPr>
-            <w:tcW w:w="1300" w:type="dxa"/>
-            <w:shd w:val="clear" w:color="auto" w:fill="D9D9D9" w:themeFill="background1" w:themeFillShade="D9"/>
-          </w:tcPr>
-          <w:p>
-            <w:pPr>
-              <w:rPr>
-                <w:b/>
-              </w:rPr>
-            </w:pPr>
-            <w:r>
-              <w:rPr>
-                <w:b/>
-              </w:rPr>
-              <w:t>Hours</w:t>
-            </w:r>
-          </w:p>
-        </w:tc>
-        <w:tc>
-          <w:tcPr>
-            <w:tcW w:w="1300" w:type="dxa"/>
-            <w:shd w:val="clear" w:color="auto" w:fill="D9D9D9" w:themeFill="background1" w:themeFillShade="D9"/>
-          </w:tcPr>
-          <w:p>
-            <w:pPr>
-              <w:rPr>
-                <w:b/>
-              </w:rPr>
-            </w:pPr>
-            <w:r>
-              <w:rPr>
-                <w:b/>
-              </w:rPr>
-              <w:t>Rate</w:t>
-            </w:r>
-          </w:p>
-        </w:tc>
-        <w:tc>
-          <w:tcPr>
-            <w:tcW w:w="1600" w:type="dxa"/>
-            <w:shd w:val="clear" w:color="auto" w:fill="D9D9D9" w:themeFill="background1" w:themeFillShade="D9"/>
-          </w:tcPr>
-          <w:p>
-            <w:pPr>
-              <w:rPr>
-                <w:b/>
-              </w:rPr>
-            </w:pPr>
-            <w:r>
-              <w:rPr>
-                <w:b/>
-              </w:rPr>
-              <w:t>Cost</w:t>
-            </w:r>
-          </w:p>
-        </w:tc>
-      </w:tr>
-      <w:tr>
-        <w:tc>
-          <w:tcPr>
-            <w:tcW w:w="2600" w:type="dxa"/>
-          </w:tcPr>
-          <w:p>
-            <w:pPr>
-              <w:rPr/>
-            </w:pPr>
-            <w:r>
-              <w:rPr/>
-              <w:t>{%tr for row in phase_hours_rows %}</w:t>
-            </w:r>
-          </w:p>
-        </w:tc>
-        <w:tc>
-          <w:tcPr>
-            <w:tcW w:w="2600" w:type="dxa"/>
-          </w:tcPr>
-          <w:p>
-            <w:pPr>
-              <w:rPr/>
-            </w:pPr>
-            <w:r>
-              <w:rPr/>
-              <w:t/>
-            </w:r>
-          </w:p>
-        </w:tc>
-        <w:tc>
-          <w:tcPr>
-            <w:tcW w:w="1300" w:type="dxa"/>
-          </w:tcPr>
-          <w:p>
-            <w:pPr>
-              <w:rPr/>
-            </w:pPr>
-            <w:r>
-              <w:rPr/>
-              <w:t/>
-            </w:r>
-          </w:p>
-        </w:tc>
-        <w:tc>
-          <w:tcPr>
-            <w:tcW w:w="1300" w:type="dxa"/>
-          </w:tcPr>
-          <w:p>
-            <w:pPr>
-              <w:rPr/>
-            </w:pPr>
-            <w:r>
-              <w:rPr/>
-              <w:t/>
-            </w:r>
-          </w:p>
-        </w:tc>
-        <w:tc>
-          <w:tcPr>
-            <w:tcW w:w="1600" w:type="dxa"/>
-          </w:tcPr>
-          <w:p>
-            <w:pPr>
-              <w:rPr/>
-            </w:pPr>
-            <w:r>
-              <w:rPr/>
-              <w:t/>
-            </w:r>
-          </w:p>
-        </w:tc>
-      </w:tr>
-      <w:tr>
-        <w:tc>
-          <w:tcPr>
-            <w:tcW w:w="2600" w:type="dxa"/>
-          </w:tcPr>
-          <w:p>
-            <w:pPr>
-              <w:rPr/>
-            </w:pPr>
-            <w:r>
-              <w:rPr/>
-              <w:t>{{ row.phase }}</w:t>
-            </w:r>
-          </w:p>
-        </w:tc>
-        <w:tc>
-          <w:tcPr>
-            <w:tcW w:w="2600" w:type="dxa"/>
-          </w:tcPr>
-          <w:p>
-            <w:pPr>
-              <w:rPr/>
-            </w:pPr>
-            <w:r>
-              <w:rPr/>
-              <w:t>{{ row.role }}</w:t>
-            </w:r>
-          </w:p>
-        </w:tc>
-        <w:tc>
-          <w:tcPr>
-            <w:tcW w:w="1300" w:type="dxa"/>
-          </w:tcPr>
-          <w:p>
-            <w:pPr>
-              <w:rPr/>
-            </w:pPr>
-            <w:r>
-              <w:rPr/>
-              <w:t>{{ row.hours_display }}</w:t>
-            </w:r>
-          </w:p>
-        </w:tc>
-        <w:tc>
-          <w:tcPr>
-            <w:tcW w:w="1300" w:type="dxa"/>
-          </w:tcPr>
-          <w:p>
-            <w:pPr>
-              <w:rPr/>
-            </w:pPr>
-            <w:r>
-              <w:rPr/>
-              <w:t>{{ row.rate_display }}</w:t>
-            </w:r>
-          </w:p>
-        </w:tc>
-        <w:tc>
-          <w:tcPr>
-            <w:tcW w:w="1600" w:type="dxa"/>
-          </w:tcPr>
-          <w:p>
-            <w:pPr>
-              <w:rPr/>
-            </w:pPr>
-            <w:r>
-              <w:rPr/>
-              <w:t>{{ row.cost_display }}</w:t>
-            </w:r>
-          </w:p>
-        </w:tc>
-      </w:tr>
-      <w:tr>
-        <w:tc>
-          <w:tcPr>
-            <w:tcW w:w="2600" w:type="dxa"/>
-          </w:tcPr>
-          <w:p>
-            <w:pPr>
-              <w:rPr/>
-            </w:pPr>
-            <w:r>
-              <w:rPr/>
-              <w:t>{%tr endfor %}</w:t>
-            </w:r>
-          </w:p>
-        </w:tc>
-        <w:tc>
-          <w:tcPr>
-            <w:tcW w:w="2600" w:type="dxa"/>
-          </w:tcPr>
-          <w:p>
-            <w:pPr>
-              <w:rPr/>
-            </w:pPr>
-            <w:r>
-              <w:rPr/>
-              <w:t/>
-            </w:r>
-          </w:p>
-        </w:tc>
-        <w:tc>
-          <w:tcPr>
-            <w:tcW w:w="1300" w:type="dxa"/>
-          </w:tcPr>
-          <w:p>
-            <w:pPr>
-              <w:rPr/>
-            </w:pPr>
-            <w:r>
-              <w:rPr/>
-              <w:t/>
-            </w:r>
-          </w:p>
-        </w:tc>
-        <w:tc>
-          <w:tcPr>
-            <w:tcW w:w="1300" w:type="dxa"/>
-          </w:tcPr>
-          <w:p>
-            <w:pPr>
-              <w:rPr/>
-            </w:pPr>
-            <w:r>
-              <w:rPr/>
-              <w:t/>
-            </w:r>
-          </w:p>
-        </w:tc>
-        <w:tc>
-          <w:tcPr>
-            <w:tcW w:w="1600" w:type="dxa"/>
-          </w:tcPr>
-          <w:p>
-            <w:pPr>
-              <w:rPr/>
-            </w:pPr>
-            <w:r>
-              <w:rPr/>
-              <w:t/>
-            </w:r>
-          </w:p>
-        </w:tc>
-      </w:tr>
-    </w:tbl>
     <w:p>
       <w:r>
-        <w:t/>
-      </w:r>
-    </w:p>
-    <w:p>
-      <w:pPr>
-        <w:rPr>
-          <w:rStyle w:val="Strong"/>
-        </w:rPr>
-      </w:pPr>
-      <w:r>
-        <w:rPr>
-          <w:rStyle w:val="Strong"/>
-        </w:rPr>
-        <w:t>Resource Totals</w:t>
-      </w:r>
-    </w:p>
-    <w:tbl>
-      <w:tblPr>
-        <w:tblStyle w:val="TableGrid"/>
-        <w:tblW w:w="0" w:type="auto"/>
-        <w:tblLook w:val="04A0" w:firstRow="1" w:lastRow="1" w:firstColumn="1" w:lastColumn="0" w:noHBand="0" w:noVBand="1"/>
-      </w:tblPr>
-      <w:tblGrid>
-        <w:gridCol w:w="2200"/>
-        <w:gridCol w:w="1100"/>
-        <w:gridCol w:w="1800"/>
-        <w:gridCol w:w="1600"/>
-        <w:gridCol w:w="1800"/>
-      </w:tblGrid>
-      <w:tr>
-        <w:tc>
-          <w:tcPr>
-            <w:tcW w:w="2200" w:type="dxa"/>
-            <w:shd w:val="clear" w:color="auto" w:fill="D9D9D9" w:themeFill="background1" w:themeFillShade="D9"/>
-          </w:tcPr>
-          <w:p>
-            <w:pPr>
-              <w:rPr>
-                <w:b/>
-              </w:rPr>
-            </w:pPr>
-            <w:r>
-              <w:rPr>
-                <w:b/>
-              </w:rPr>
-              <w:t>Role</w:t>
-            </w:r>
-          </w:p>
-        </w:tc>
-        <w:tc>
-          <w:tcPr>
-            <w:tcW w:w="1100" w:type="dxa"/>
-            <w:shd w:val="clear" w:color="auto" w:fill="D9D9D9" w:themeFill="background1" w:themeFillShade="D9"/>
-          </w:tcPr>
-          <w:p>
-            <w:pPr>
-              <w:rPr>
-                <w:b/>
-              </w:rPr>
-            </w:pPr>
-            <w:r>
-              <w:rPr>
-                <w:b/>
-              </w:rPr>
-              <w:t>Count</w:t>
-            </w:r>
-          </w:p>
-        </w:tc>
-        <w:tc>
-          <w:tcPr>
-            <w:tcW w:w="1800" w:type="dxa"/>
-            <w:shd w:val="clear" w:color="auto" w:fill="D9D9D9" w:themeFill="background1" w:themeFillShade="D9"/>
-          </w:tcPr>
-          <w:p>
-            <w:pPr>
-              <w:rPr>
-                <w:b/>
-              </w:rPr>
-            </w:pPr>
-            <w:r>
-              <w:rPr>
-                <w:b/>
-              </w:rPr>
-              <w:t>Total Hours</w:t>
-            </w:r>
-          </w:p>
-        </w:tc>
-        <w:tc>
-          <w:tcPr>
-            <w:tcW w:w="1600" w:type="dxa"/>
-            <w:shd w:val="clear" w:color="auto" w:fill="D9D9D9" w:themeFill="background1" w:themeFillShade="D9"/>
-          </w:tcPr>
-          <w:p>
-            <w:pPr>
-              <w:rPr>
-                <w:b/>
-              </w:rPr>
-            </w:pPr>
-            <w:r>
-              <w:rPr>
-                <w:b/>
-              </w:rPr>
-              <w:t>Rate</w:t>
-            </w:r>
-          </w:p>
-        </w:tc>
-        <w:tc>
-          <w:tcPr>
-            <w:tcW w:w="1800" w:type="dxa"/>
-            <w:shd w:val="clear" w:color="auto" w:fill="D9D9D9" w:themeFill="background1" w:themeFillShade="D9"/>
-          </w:tcPr>
-          <w:p>
-            <w:pPr>
-              <w:rPr>
-                <w:b/>
-              </w:rPr>
-            </w:pPr>
-            <w:r>
-              <w:rPr>
-                <w:b/>
-              </w:rPr>
-              <w:t>Total Cost</w:t>
-            </w:r>
-          </w:p>
-        </w:tc>
-      </w:tr>
-      <w:tr>
-        <w:tc>
-          <w:tcPr>
-            <w:tcW w:w="2200" w:type="dxa"/>
-          </w:tcPr>
-          <w:p>
-            <w:pPr>
-              <w:rPr/>
-            </w:pPr>
-            <w:r>
-              <w:rPr/>
-              <w:t>{%tr for total in phase_hours_totals %}</w:t>
-            </w:r>
-          </w:p>
-        </w:tc>
-        <w:tc>
-          <w:tcPr>
-            <w:tcW w:w="1100" w:type="dxa"/>
-          </w:tcPr>
-          <w:p>
-            <w:pPr>
-              <w:rPr/>
-            </w:pPr>
-            <w:r>
-              <w:rPr/>
-              <w:t/>
-            </w:r>
-          </w:p>
-        </w:tc>
-        <w:tc>
-          <w:tcPr>
-            <w:tcW w:w="1800" w:type="dxa"/>
-          </w:tcPr>
-          <w:p>
-            <w:pPr>
-              <w:rPr/>
-            </w:pPr>
-            <w:r>
-              <w:rPr/>
-              <w:t/>
-            </w:r>
-          </w:p>
-        </w:tc>
-        <w:tc>
-          <w:tcPr>
-            <w:tcW w:w="1600" w:type="dxa"/>
-          </w:tcPr>
-          <w:p>
-            <w:pPr>
-              <w:rPr/>
-            </w:pPr>
-            <w:r>
-              <w:rPr/>
-              <w:t/>
-            </w:r>
-          </w:p>
-        </w:tc>
-        <w:tc>
-          <w:tcPr>
-            <w:tcW w:w="1800" w:type="dxa"/>
-          </w:tcPr>
-          <w:p>
-            <w:pPr>
-              <w:rPr/>
-            </w:pPr>
-            <w:r>
-              <w:rPr/>
-              <w:t/>
-            </w:r>
-          </w:p>
-        </w:tc>
-      </w:tr>
-      <w:tr>
-        <w:tc>
-          <w:tcPr>
-            <w:tcW w:w="2200" w:type="dxa"/>
-          </w:tcPr>
-          <w:p>
-            <w:pPr>
-              <w:rPr/>
-            </w:pPr>
-            <w:r>
-              <w:rPr/>
-              <w:t>{{ total.role }}</w:t>
-            </w:r>
-          </w:p>
-        </w:tc>
-        <w:tc>
-          <w:tcPr>
-            <w:tcW w:w="1100" w:type="dxa"/>
-          </w:tcPr>
-          <w:p>
-            <w:pPr>
-              <w:rPr/>
-            </w:pPr>
-            <w:r>
-              <w:rPr/>
-              <w:t>{{ total.count }}</w:t>
-            </w:r>
-          </w:p>
-        </w:tc>
-        <w:tc>
-          <w:tcPr>
-            <w:tcW w:w="1800" w:type="dxa"/>
-          </w:tcPr>
-          <w:p>
-            <w:pPr>
-              <w:rPr/>
-            </w:pPr>
-            <w:r>
-              <w:rPr/>
-              <w:t>{{ total.hours_display }}</w:t>
-            </w:r>
-          </w:p>
-        </w:tc>
-        <w:tc>
-          <w:tcPr>
-            <w:tcW w:w="1600" w:type="dxa"/>
-          </w:tcPr>
-          <w:p>
-            <w:pPr>
-              <w:rPr/>
-            </w:pPr>
-            <w:r>
-              <w:rPr/>
-              <w:t>{{ total.rate_display }}</w:t>
-            </w:r>
-          </w:p>
-        </w:tc>
-        <w:tc>
-          <w:tcPr>
-            <w:tcW w:w="1800" w:type="dxa"/>
-          </w:tcPr>
-          <w:p>
-            <w:pPr>
-              <w:rPr/>
-            </w:pPr>
-            <w:r>
-              <w:rPr/>
-              <w:t>{{ total.cost_display }}</w:t>
-            </w:r>
-          </w:p>
-        </w:tc>
-      </w:tr>
-      <w:tr>
-        <w:tc>
-          <w:tcPr>
-            <w:tcW w:w="2200" w:type="dxa"/>
-          </w:tcPr>
-          <w:p>
-            <w:pPr>
-              <w:rPr/>
-            </w:pPr>
-            <w:r>
-              <w:rPr/>
-              <w:t>{%tr endfor %}</w:t>
-            </w:r>
-          </w:p>
-        </w:tc>
-        <w:tc>
-          <w:tcPr>
-            <w:tcW w:w="1100" w:type="dxa"/>
-          </w:tcPr>
-          <w:p>
-            <w:pPr>
-              <w:rPr/>
-            </w:pPr>
-            <w:r>
-              <w:rPr/>
-              <w:t/>
-            </w:r>
-          </w:p>
-        </w:tc>
-        <w:tc>
-          <w:tcPr>
-            <w:tcW w:w="1800" w:type="dxa"/>
-          </w:tcPr>
-          <w:p>
-            <w:pPr>
-              <w:rPr/>
-            </w:pPr>
-            <w:r>
-              <w:rPr/>
-              <w:t/>
-            </w:r>
-          </w:p>
-        </w:tc>
-        <w:tc>
-          <w:tcPr>
-            <w:tcW w:w="1600" w:type="dxa"/>
-          </w:tcPr>
-          <w:p>
-            <w:pPr>
-              <w:rPr/>
-            </w:pPr>
-            <w:r>
-              <w:rPr/>
-              <w:t/>
-            </w:r>
-          </w:p>
-        </w:tc>
-        <w:tc>
-          <w:tcPr>
-            <w:tcW w:w="1800" w:type="dxa"/>
-          </w:tcPr>
-          <w:p>
-            <w:pPr>
-              <w:rPr/>
-            </w:pPr>
-            <w:r>
-              <w:rPr/>
-              <w:t/>
-            </w:r>
-          </w:p>
-        </w:tc>
-      </w:tr>
-      <w:tr>
-        <w:tc>
-          <w:tcPr>
-            <w:tcW w:w="2200" w:type="dxa"/>
-            <w:shd w:val="clear" w:color="auto" w:fill="D9D9D9" w:themeFill="background1" w:themeFillShade="D9"/>
-          </w:tcPr>
-          <w:p>
-            <w:pPr>
-              <w:rPr>
-                <w:b/>
-              </w:rPr>
-            </w:pPr>
-            <w:r>
-              <w:rPr>
-                <w:b/>
-              </w:rPr>
-              <w:t>Grand Total</w:t>
-            </w:r>
-          </w:p>
-        </w:tc>
-        <w:tc>
-          <w:tcPr>
-            <w:tcW w:w="1100" w:type="dxa"/>
-            <w:shd w:val="clear" w:color="auto" w:fill="D9D9D9" w:themeFill="background1" w:themeFillShade="D9"/>
-          </w:tcPr>
-          <w:p>
-            <w:pPr>
-              <w:rPr>
-                <w:b/>
-              </w:rPr>
-            </w:pPr>
-            <w:r>
-              <w:rPr>
-                <w:b/>
-              </w:rPr>
-              <w:t/>
-            </w:r>
-          </w:p>
-        </w:tc>
-        <w:tc>
-          <w:tcPr>
-            <w:tcW w:w="1800" w:type="dxa"/>
-            <w:shd w:val="clear" w:color="auto" w:fill="D9D9D9" w:themeFill="background1" w:themeFillShade="D9"/>
-          </w:tcPr>
-          <w:p>
-            <w:pPr>
-              <w:rPr>
-                <w:b/>
-              </w:rPr>
-            </w:pPr>
-            <w:r>
-              <w:rPr>
-                <w:b/>
-              </w:rPr>
-              <w:t>{{ grand_total_hours }}</w:t>
-            </w:r>
-          </w:p>
-        </w:tc>
-        <w:tc>
-          <w:tcPr>
-            <w:tcW w:w="1600" w:type="dxa"/>
-            <w:shd w:val="clear" w:color="auto" w:fill="D9D9D9" w:themeFill="background1" w:themeFillShade="D9"/>
-          </w:tcPr>
-          <w:p>
-            <w:pPr>
-              <w:rPr>
-                <w:b/>
-              </w:rPr>
-            </w:pPr>
-            <w:r>
-              <w:rPr>
-                <w:b/>
-              </w:rPr>
-              <w:t/>
-            </w:r>
-          </w:p>
-        </w:tc>
-        <w:tc>
-          <w:tcPr>
-            <w:tcW w:w="1800" w:type="dxa"/>
-            <w:shd w:val="clear" w:color="auto" w:fill="D9D9D9" w:themeFill="background1" w:themeFillShade="D9"/>
-          </w:tcPr>
-          <w:p>
-            <w:pPr>
-              <w:rPr>
-                <w:b/>
-              </w:rPr>
-            </w:pPr>
-            <w:r>
-              <w:rPr>
-                <w:b/>
-              </w:rPr>
-              <w:t>{{ grand_total_cost }}</w:t>
-            </w:r>
-          </w:p>
-        </w:tc>
-      </w:tr>
-    </w:tbl>
+        <w:t>__DOCAGENT_PHASE_HOURS_MATRIX__</w:t>
+      </w:r>
+    </w:p>
     <w:p>
       <w:r>
         <w:t/>
@@ -5324,7 +4560,7 @@
     </w:p>
     <w:p ns2:paraId="7557B54C" ns2:textId="77777777"/>
     <w:sectPr>
-      <w:footerReference w:type="default" r:id="rId10"/>
+      <w:footerReference w:type="default" ns7:id="rId10"/>
       <w:pgSz w:w="12240" w:h="15840"/>
       <w:pgMar w:top="720" w:right="720" w:bottom="720" w:left="720" w:header="720" w:footer="720" w:gutter="0"/>
       <w:cols w:space="720"/>

</xml_diff>